<commit_message>
added the new documents into the folder
</commit_message>
<xml_diff>
--- a/Electronics/Circuit Documentation Kids Kit - for merge.docx
+++ b/Electronics/Circuit Documentation Kids Kit - for merge.docx
@@ -125,68 +125,91 @@
         <w:pStyle w:val="Heading3"/>
       </w:pPr>
       <w:bookmarkStart w:id="0" w:name="simple-circuit"/>
-      <w:bookmarkStart w:id="1" w:name="_GoBack"/>
-      <w:r>
-        <w:t>📘</w:t>
-      </w:r>
+      <w:r>
+        <w:t>📘 1. Simple Circuit</w:t>
+      </w:r>
+    </w:p>
+    <w:p>
+      <w:pPr>
+        <w:pStyle w:val="FirstParagraph"/>
+        <w:rPr>
+          <w:sz w:val="28"/>
+          <w:szCs w:val="28"/>
+        </w:rPr>
+      </w:pPr>
+      <w:r>
+        <w:rPr>
+          <w:sz w:val="28"/>
+          <w:szCs w:val="28"/>
+        </w:rPr>
+        <w:t>Good Morning/Good Afternoon,</w:t>
+      </w:r>
+    </w:p>
+    <w:p>
+      <w:pPr>
+        <w:pStyle w:val="BodyText"/>
+        <w:rPr>
+          <w:sz w:val="28"/>
+          <w:szCs w:val="28"/>
+        </w:rPr>
+      </w:pPr>
+      <w:r>
+        <w:rPr>
+          <w:sz w:val="28"/>
+          <w:szCs w:val="28"/>
+        </w:rPr>
+        <w:t>My name is {Student Name} of 4th {Section}. Today, I am going to explain my project titled ‘Simple Circuit’.</w:t>
+      </w:r>
+    </w:p>
+    <w:p>
+      <w:pPr>
+        <w:pStyle w:val="Heading4"/>
+        <w:rPr>
+          <w:sz w:val="28"/>
+          <w:szCs w:val="28"/>
+        </w:rPr>
+      </w:pPr>
+      <w:bookmarkStart w:id="1" w:name="introduction"/>
+      <w:r>
+        <w:rPr>
+          <w:sz w:val="28"/>
+          <w:szCs w:val="28"/>
+        </w:rPr>
+        <w:t>🔹 Introduction</w:t>
+      </w:r>
+    </w:p>
+    <w:p>
+      <w:pPr>
+        <w:pStyle w:val="FirstParagraph"/>
+        <w:rPr>
+          <w:sz w:val="28"/>
+          <w:szCs w:val="28"/>
+        </w:rPr>
+      </w:pPr>
+      <w:r>
+        <w:rPr>
+          <w:sz w:val="28"/>
+          <w:szCs w:val="28"/>
+        </w:rPr>
+        <w:t>In this experiment, we constructed a simple electric circuit. This activity helped us understand how electric current flows in a closed path. It also introduced the concept of a complete circuit and how a light-emitting diode (LED) can be powered using a battery.</w:t>
+      </w:r>
+    </w:p>
+    <w:p>
+      <w:pPr>
+        <w:pStyle w:val="Heading4"/>
+        <w:rPr>
+          <w:sz w:val="28"/>
+          <w:szCs w:val="28"/>
+        </w:rPr>
+      </w:pPr>
+      <w:bookmarkStart w:id="2" w:name="components-used"/>
       <w:bookmarkEnd w:id="1"/>
       <w:r>
-        <w:t xml:space="preserve"> 1. Simple Circuit</w:t>
-      </w:r>
-    </w:p>
-    <w:p>
-      <w:pPr>
-        <w:pStyle w:val="FirstParagraph"/>
-      </w:pPr>
-      <w:r>
-        <w:t>Good Morning/Good Afternoon,</w:t>
-      </w:r>
-    </w:p>
-    <w:p>
-      <w:pPr>
-        <w:pStyle w:val="BodyText"/>
-      </w:pPr>
-      <w:r>
-        <w:t>My name is {Student Name} of 4t</w:t>
-      </w:r>
-      <w:r>
-        <w:t>h {Section}. Today, I am going to explain my project titled ‘Simple Circuit’.</w:t>
-      </w:r>
-    </w:p>
-    <w:p>
-      <w:pPr>
-        <w:pStyle w:val="Heading4"/>
-      </w:pPr>
-      <w:bookmarkStart w:id="2" w:name="introduction"/>
-      <w:r>
-        <w:t>🔹</w:t>
-      </w:r>
-      <w:r>
-        <w:t xml:space="preserve"> Introduction</w:t>
-      </w:r>
-    </w:p>
-    <w:p>
-      <w:pPr>
-        <w:pStyle w:val="FirstParagraph"/>
-      </w:pPr>
-      <w:r>
-        <w:t>In this experiment, we constructed a simple electric circuit. This activity helped us understand how electric current flows in a closed path. It also introduced t</w:t>
-      </w:r>
-      <w:r>
-        <w:t>he concept of a complete circuit and how a light-emitting diode (LED) can be powered using a battery.</w:t>
-      </w:r>
-    </w:p>
-    <w:p>
-      <w:pPr>
-        <w:pStyle w:val="Heading4"/>
-      </w:pPr>
-      <w:bookmarkStart w:id="3" w:name="components-used"/>
-      <w:bookmarkEnd w:id="2"/>
-      <w:r>
-        <w:t>🔹</w:t>
-      </w:r>
-      <w:r>
-        <w:t xml:space="preserve"> Components Used</w:t>
+        <w:rPr>
+          <w:sz w:val="28"/>
+          <w:szCs w:val="28"/>
+        </w:rPr>
+        <w:t>🔹 Components Used</w:t>
       </w:r>
     </w:p>
     <w:p>
@@ -196,8 +219,16 @@
           <w:ilvl w:val="0"/>
           <w:numId w:val="2"/>
         </w:numPr>
-      </w:pPr>
-      <w:r>
+        <w:rPr>
+          <w:sz w:val="28"/>
+          <w:szCs w:val="28"/>
+        </w:rPr>
+      </w:pPr>
+      <w:r>
+        <w:rPr>
+          <w:sz w:val="28"/>
+          <w:szCs w:val="28"/>
+        </w:rPr>
         <w:t>1 Battery</w:t>
       </w:r>
     </w:p>
@@ -208,8 +239,16 @@
           <w:ilvl w:val="0"/>
           <w:numId w:val="2"/>
         </w:numPr>
-      </w:pPr>
-      <w:r>
+        <w:rPr>
+          <w:sz w:val="28"/>
+          <w:szCs w:val="28"/>
+        </w:rPr>
+      </w:pPr>
+      <w:r>
+        <w:rPr>
+          <w:sz w:val="28"/>
+          <w:szCs w:val="28"/>
+        </w:rPr>
         <w:t>1 Switch</w:t>
       </w:r>
     </w:p>
@@ -220,8 +259,16 @@
           <w:ilvl w:val="0"/>
           <w:numId w:val="2"/>
         </w:numPr>
-      </w:pPr>
-      <w:r>
+        <w:rPr>
+          <w:sz w:val="28"/>
+          <w:szCs w:val="28"/>
+        </w:rPr>
+      </w:pPr>
+      <w:r>
+        <w:rPr>
+          <w:sz w:val="28"/>
+          <w:szCs w:val="28"/>
+        </w:rPr>
         <w:t>1 LED (Light Emitting Diode)</w:t>
       </w:r>
     </w:p>
@@ -232,22 +279,35 @@
           <w:ilvl w:val="0"/>
           <w:numId w:val="2"/>
         </w:numPr>
-      </w:pPr>
-      <w:r>
+        <w:rPr>
+          <w:sz w:val="28"/>
+          <w:szCs w:val="28"/>
+        </w:rPr>
+      </w:pPr>
+      <w:r>
+        <w:rPr>
+          <w:sz w:val="28"/>
+          <w:szCs w:val="28"/>
+        </w:rPr>
         <w:t>1 Base board with holders</w:t>
       </w:r>
     </w:p>
     <w:p>
       <w:pPr>
         <w:pStyle w:val="Heading4"/>
-      </w:pPr>
-      <w:bookmarkStart w:id="4" w:name="building-procedure"/>
-      <w:bookmarkEnd w:id="3"/>
-      <w:r>
-        <w:t>🔹</w:t>
-      </w:r>
-      <w:r>
-        <w:t xml:space="preserve"> Building Procedure</w:t>
+        <w:rPr>
+          <w:sz w:val="28"/>
+          <w:szCs w:val="28"/>
+        </w:rPr>
+      </w:pPr>
+      <w:bookmarkStart w:id="3" w:name="building-procedure"/>
+      <w:bookmarkEnd w:id="2"/>
+      <w:r>
+        <w:rPr>
+          <w:sz w:val="28"/>
+          <w:szCs w:val="28"/>
+        </w:rPr>
+        <w:t>🔹 Building Procedure</w:t>
       </w:r>
     </w:p>
     <w:p>
@@ -257,12 +317,17 @@
           <w:ilvl w:val="0"/>
           <w:numId w:val="3"/>
         </w:numPr>
-      </w:pPr>
-      <w:r>
-        <w:t>We placed the battery into the designat</w:t>
-      </w:r>
-      <w:r>
-        <w:t>ed slot on the base board.</w:t>
+        <w:rPr>
+          <w:sz w:val="28"/>
+          <w:szCs w:val="28"/>
+        </w:rPr>
+      </w:pPr>
+      <w:r>
+        <w:rPr>
+          <w:sz w:val="28"/>
+          <w:szCs w:val="28"/>
+        </w:rPr>
+        <w:t>We placed the battery into the designated slot on the base board.</w:t>
       </w:r>
     </w:p>
     <w:p>
@@ -272,8 +337,16 @@
           <w:ilvl w:val="0"/>
           <w:numId w:val="3"/>
         </w:numPr>
-      </w:pPr>
-      <w:r>
+        <w:rPr>
+          <w:sz w:val="28"/>
+          <w:szCs w:val="28"/>
+        </w:rPr>
+      </w:pPr>
+      <w:r>
+        <w:rPr>
+          <w:sz w:val="28"/>
+          <w:szCs w:val="28"/>
+        </w:rPr>
         <w:t>We inserted the LED into its holder, ensuring it was connected correctly with the positive and negative sides.</w:t>
       </w:r>
     </w:p>
@@ -284,8 +357,16 @@
           <w:ilvl w:val="0"/>
           <w:numId w:val="3"/>
         </w:numPr>
-      </w:pPr>
-      <w:r>
+        <w:rPr>
+          <w:sz w:val="28"/>
+          <w:szCs w:val="28"/>
+        </w:rPr>
+      </w:pPr>
+      <w:r>
+        <w:rPr>
+          <w:sz w:val="28"/>
+          <w:szCs w:val="28"/>
+        </w:rPr>
         <w:t>The battery and LED connections were made with the metal contacts in the holders.</w:t>
       </w:r>
     </w:p>
@@ -296,12 +377,17 @@
           <w:ilvl w:val="0"/>
           <w:numId w:val="3"/>
         </w:numPr>
-      </w:pPr>
-      <w:r>
-        <w:t xml:space="preserve">We connected the switch between the </w:t>
-      </w:r>
-      <w:r>
-        <w:t>battery and the LED, then turned it on.</w:t>
+        <w:rPr>
+          <w:sz w:val="28"/>
+          <w:szCs w:val="28"/>
+        </w:rPr>
+      </w:pPr>
+      <w:r>
+        <w:rPr>
+          <w:sz w:val="28"/>
+          <w:szCs w:val="28"/>
+        </w:rPr>
+        <w:t>We connected the switch between the battery and the LED, then turned it on.</w:t>
       </w:r>
     </w:p>
     <w:p>
@@ -311,107 +397,149 @@
           <w:ilvl w:val="0"/>
           <w:numId w:val="3"/>
         </w:numPr>
-      </w:pPr>
-      <w:r>
+        <w:rPr>
+          <w:sz w:val="28"/>
+          <w:szCs w:val="28"/>
+        </w:rPr>
+      </w:pPr>
+      <w:r>
+        <w:rPr>
+          <w:sz w:val="28"/>
+          <w:szCs w:val="28"/>
+        </w:rPr>
         <w:t>The LED turned on, indicating that the circuit was complete and current was flowing.</w:t>
       </w:r>
     </w:p>
     <w:p>
       <w:pPr>
         <w:pStyle w:val="Heading4"/>
-      </w:pPr>
-      <w:bookmarkStart w:id="5" w:name="observation-and-conclusion"/>
+        <w:rPr>
+          <w:sz w:val="28"/>
+          <w:szCs w:val="28"/>
+        </w:rPr>
+      </w:pPr>
+      <w:bookmarkStart w:id="4" w:name="observation-and-conclusion"/>
+      <w:bookmarkEnd w:id="3"/>
+      <w:r>
+        <w:rPr>
+          <w:sz w:val="28"/>
+          <w:szCs w:val="28"/>
+        </w:rPr>
+        <w:t>🔹 Observation and Conclusion</w:t>
+      </w:r>
+    </w:p>
+    <w:p>
+      <w:pPr>
+        <w:pStyle w:val="FirstParagraph"/>
+        <w:rPr>
+          <w:sz w:val="28"/>
+          <w:szCs w:val="28"/>
+        </w:rPr>
+      </w:pPr>
+      <w:r>
+        <w:rPr>
+          <w:sz w:val="28"/>
+          <w:szCs w:val="28"/>
+        </w:rPr>
+        <w:t>We observed that the LED only turned on when all components were securely connected. This proved that electric current requires a closed and complete path to flow. We also learned that electrical energy from the battery was converted into light energy by the LED.</w:t>
+      </w:r>
+    </w:p>
+    <w:p/>
+    <w:p/>
+    <w:p/>
+    <w:p>
+      <w:pPr>
+        <w:pStyle w:val="Heading3"/>
+      </w:pPr>
+      <w:bookmarkStart w:id="5" w:name="series-circuit"/>
+      <w:bookmarkEnd w:id="0"/>
       <w:bookmarkEnd w:id="4"/>
       <w:r>
-        <w:t>🔹</w:t>
-      </w:r>
-      <w:r>
-        <w:t xml:space="preserve"> Observation and Conclusion</w:t>
+        <w:lastRenderedPageBreak/>
+        <w:t>📘 2. Series Circuit</w:t>
       </w:r>
     </w:p>
     <w:p>
       <w:pPr>
         <w:pStyle w:val="FirstParagraph"/>
-      </w:pPr>
-      <w:r>
-        <w:t>We observed that the LED only turned on when all components were securely connected. This proved that</w:t>
-      </w:r>
-      <w:r>
-        <w:t xml:space="preserve"> electric current requires a closed and complete path to flow. We also learned that electrical energy from the battery was converted into light energy by the LED.</w:t>
-      </w:r>
-    </w:p>
-    <w:p>
-      <w:r>
-        <w:pict>
-          <v:rect id="_x0000_i1025" style="width:0;height:1.5pt" o:hralign="center" o:hrstd="t" o:hr="t"/>
-        </w:pict>
-      </w:r>
-    </w:p>
-    <w:p>
-      <w:pPr>
-        <w:pStyle w:val="Heading3"/>
-      </w:pPr>
-      <w:bookmarkStart w:id="6" w:name="series-circuit"/>
-      <w:bookmarkEnd w:id="0"/>
-      <w:bookmarkEnd w:id="5"/>
-      <w:r>
-        <w:t>📘</w:t>
-      </w:r>
-      <w:r>
-        <w:t xml:space="preserve"> 2. Series Circuit</w:t>
+        <w:rPr>
+          <w:sz w:val="28"/>
+          <w:szCs w:val="28"/>
+        </w:rPr>
+      </w:pPr>
+      <w:r>
+        <w:rPr>
+          <w:sz w:val="28"/>
+          <w:szCs w:val="28"/>
+        </w:rPr>
+        <w:t>Good Morning/Good Afternoon,</w:t>
+      </w:r>
+    </w:p>
+    <w:p>
+      <w:pPr>
+        <w:pStyle w:val="BodyText"/>
+        <w:rPr>
+          <w:sz w:val="28"/>
+          <w:szCs w:val="28"/>
+        </w:rPr>
+      </w:pPr>
+      <w:r>
+        <w:rPr>
+          <w:sz w:val="28"/>
+          <w:szCs w:val="28"/>
+        </w:rPr>
+        <w:t>My name is {Student Name} of 4th {Section}. Today, I am going to explain my project titled ‘Series Circuit’.</w:t>
+      </w:r>
+    </w:p>
+    <w:p>
+      <w:pPr>
+        <w:pStyle w:val="Heading4"/>
+        <w:rPr>
+          <w:sz w:val="28"/>
+          <w:szCs w:val="28"/>
+        </w:rPr>
+      </w:pPr>
+      <w:bookmarkStart w:id="6" w:name="introduction-1"/>
+      <w:r>
+        <w:rPr>
+          <w:sz w:val="28"/>
+          <w:szCs w:val="28"/>
+        </w:rPr>
+        <w:t>🔹 Introduction</w:t>
       </w:r>
     </w:p>
     <w:p>
       <w:pPr>
         <w:pStyle w:val="FirstParagraph"/>
-      </w:pPr>
-      <w:r>
-        <w:t>Good Morning/Good Afternoon,</w:t>
-      </w:r>
-    </w:p>
-    <w:p>
-      <w:pPr>
-        <w:pStyle w:val="BodyText"/>
-      </w:pPr>
-      <w:r>
-        <w:t>My name is {Student Name} of 4th {Section}. Today, I am going to explain my project titled ‘Series Circuit’.</w:t>
+        <w:rPr>
+          <w:sz w:val="28"/>
+          <w:szCs w:val="28"/>
+        </w:rPr>
+      </w:pPr>
+      <w:r>
+        <w:rPr>
+          <w:sz w:val="28"/>
+          <w:szCs w:val="28"/>
+        </w:rPr>
+        <w:t>In this activity, we built a series circuit. The purpose was to observe how current flows through multiple components connected one after another, in a single continuous path.</w:t>
       </w:r>
     </w:p>
     <w:p>
       <w:pPr>
         <w:pStyle w:val="Heading4"/>
-      </w:pPr>
-      <w:bookmarkStart w:id="7" w:name="introduction-1"/>
-      <w:r>
-        <w:lastRenderedPageBreak/>
-        <w:t>🔹</w:t>
-      </w:r>
-      <w:r>
-        <w:t xml:space="preserve"> Introduction</w:t>
-      </w:r>
-    </w:p>
-    <w:p>
-      <w:pPr>
-        <w:pStyle w:val="FirstParagraph"/>
-      </w:pPr>
-      <w:r>
-        <w:t>In this activity, we built a series circuit. The purpose was to observe how current flows through multiple components connected one</w:t>
-      </w:r>
-      <w:r>
-        <w:t xml:space="preserve"> after another, in a single continuous path.</w:t>
-      </w:r>
-    </w:p>
-    <w:p>
-      <w:pPr>
-        <w:pStyle w:val="Heading4"/>
-      </w:pPr>
-      <w:bookmarkStart w:id="8" w:name="components-used-1"/>
-      <w:bookmarkEnd w:id="7"/>
-      <w:r>
-        <w:t>🔹</w:t>
-      </w:r>
-      <w:r>
-        <w:t xml:space="preserve"> Components Used</w:t>
+        <w:rPr>
+          <w:sz w:val="28"/>
+          <w:szCs w:val="28"/>
+        </w:rPr>
+      </w:pPr>
+      <w:bookmarkStart w:id="7" w:name="components-used-1"/>
+      <w:bookmarkEnd w:id="6"/>
+      <w:r>
+        <w:rPr>
+          <w:sz w:val="28"/>
+          <w:szCs w:val="28"/>
+        </w:rPr>
+        <w:t>🔹 Components Used</w:t>
       </w:r>
     </w:p>
     <w:p>
@@ -421,8 +549,16 @@
           <w:ilvl w:val="0"/>
           <w:numId w:val="4"/>
         </w:numPr>
-      </w:pPr>
-      <w:r>
+        <w:rPr>
+          <w:sz w:val="28"/>
+          <w:szCs w:val="28"/>
+        </w:rPr>
+      </w:pPr>
+      <w:r>
+        <w:rPr>
+          <w:sz w:val="28"/>
+          <w:szCs w:val="28"/>
+        </w:rPr>
         <w:t>1 Battery</w:t>
       </w:r>
     </w:p>
@@ -433,8 +569,16 @@
           <w:ilvl w:val="0"/>
           <w:numId w:val="4"/>
         </w:numPr>
-      </w:pPr>
-      <w:r>
+        <w:rPr>
+          <w:sz w:val="28"/>
+          <w:szCs w:val="28"/>
+        </w:rPr>
+      </w:pPr>
+      <w:r>
+        <w:rPr>
+          <w:sz w:val="28"/>
+          <w:szCs w:val="28"/>
+        </w:rPr>
         <w:t>1 Switch</w:t>
       </w:r>
     </w:p>
@@ -445,8 +589,16 @@
           <w:ilvl w:val="0"/>
           <w:numId w:val="4"/>
         </w:numPr>
-      </w:pPr>
-      <w:r>
+        <w:rPr>
+          <w:sz w:val="28"/>
+          <w:szCs w:val="28"/>
+        </w:rPr>
+      </w:pPr>
+      <w:r>
+        <w:rPr>
+          <w:sz w:val="28"/>
+          <w:szCs w:val="28"/>
+        </w:rPr>
         <w:t>2 LEDs</w:t>
       </w:r>
     </w:p>
@@ -457,8 +609,16 @@
           <w:ilvl w:val="0"/>
           <w:numId w:val="4"/>
         </w:numPr>
-      </w:pPr>
-      <w:r>
+        <w:rPr>
+          <w:sz w:val="28"/>
+          <w:szCs w:val="28"/>
+        </w:rPr>
+      </w:pPr>
+      <w:r>
+        <w:rPr>
+          <w:sz w:val="28"/>
+          <w:szCs w:val="28"/>
+        </w:rPr>
         <w:t>1 Buzzer</w:t>
       </w:r>
     </w:p>
@@ -469,22 +629,35 @@
           <w:ilvl w:val="0"/>
           <w:numId w:val="4"/>
         </w:numPr>
-      </w:pPr>
-      <w:r>
+        <w:rPr>
+          <w:sz w:val="28"/>
+          <w:szCs w:val="28"/>
+        </w:rPr>
+      </w:pPr>
+      <w:r>
+        <w:rPr>
+          <w:sz w:val="28"/>
+          <w:szCs w:val="28"/>
+        </w:rPr>
         <w:t>1 Base board with holders</w:t>
       </w:r>
     </w:p>
     <w:p>
       <w:pPr>
         <w:pStyle w:val="Heading4"/>
-      </w:pPr>
-      <w:bookmarkStart w:id="9" w:name="building-procedure-1"/>
-      <w:bookmarkEnd w:id="8"/>
-      <w:r>
-        <w:t>🔹</w:t>
-      </w:r>
-      <w:r>
-        <w:t xml:space="preserve"> Building Procedure</w:t>
+        <w:rPr>
+          <w:sz w:val="28"/>
+          <w:szCs w:val="28"/>
+        </w:rPr>
+      </w:pPr>
+      <w:bookmarkStart w:id="8" w:name="building-procedure-1"/>
+      <w:bookmarkEnd w:id="7"/>
+      <w:r>
+        <w:rPr>
+          <w:sz w:val="28"/>
+          <w:szCs w:val="28"/>
+        </w:rPr>
+        <w:t>🔹 Building Procedure</w:t>
       </w:r>
     </w:p>
     <w:p>
@@ -494,8 +667,16 @@
           <w:ilvl w:val="0"/>
           <w:numId w:val="5"/>
         </w:numPr>
-      </w:pPr>
-      <w:r>
+        <w:rPr>
+          <w:sz w:val="28"/>
+          <w:szCs w:val="28"/>
+        </w:rPr>
+      </w:pPr>
+      <w:r>
+        <w:rPr>
+          <w:sz w:val="28"/>
+          <w:szCs w:val="28"/>
+        </w:rPr>
         <w:t>We inserted the battery into its place on the base board.</w:t>
       </w:r>
     </w:p>
@@ -506,8 +687,16 @@
           <w:ilvl w:val="0"/>
           <w:numId w:val="5"/>
         </w:numPr>
-      </w:pPr>
-      <w:r>
+        <w:rPr>
+          <w:sz w:val="28"/>
+          <w:szCs w:val="28"/>
+        </w:rPr>
+      </w:pPr>
+      <w:r>
+        <w:rPr>
+          <w:sz w:val="28"/>
+          <w:szCs w:val="28"/>
+        </w:rPr>
         <w:t>We inserted the first LED into its holder.</w:t>
       </w:r>
     </w:p>
@@ -518,12 +707,17 @@
           <w:ilvl w:val="0"/>
           <w:numId w:val="5"/>
         </w:numPr>
-      </w:pPr>
-      <w:r>
-        <w:t>We conne</w:t>
-      </w:r>
-      <w:r>
-        <w:t>cted the second LED in line with the first.</w:t>
+        <w:rPr>
+          <w:sz w:val="28"/>
+          <w:szCs w:val="28"/>
+        </w:rPr>
+      </w:pPr>
+      <w:r>
+        <w:rPr>
+          <w:sz w:val="28"/>
+          <w:szCs w:val="28"/>
+        </w:rPr>
+        <w:t>We connected the second LED in line with the first.</w:t>
       </w:r>
     </w:p>
     <w:p>
@@ -533,8 +727,16 @@
           <w:ilvl w:val="0"/>
           <w:numId w:val="5"/>
         </w:numPr>
-      </w:pPr>
-      <w:r>
+        <w:rPr>
+          <w:sz w:val="28"/>
+          <w:szCs w:val="28"/>
+        </w:rPr>
+      </w:pPr>
+      <w:r>
+        <w:rPr>
+          <w:sz w:val="28"/>
+          <w:szCs w:val="28"/>
+        </w:rPr>
         <w:t>Then, we connected the buzzer in the same series path.</w:t>
       </w:r>
     </w:p>
@@ -545,8 +747,16 @@
           <w:ilvl w:val="0"/>
           <w:numId w:val="5"/>
         </w:numPr>
-      </w:pPr>
-      <w:r>
+        <w:rPr>
+          <w:sz w:val="28"/>
+          <w:szCs w:val="28"/>
+        </w:rPr>
+      </w:pPr>
+      <w:r>
+        <w:rPr>
+          <w:sz w:val="28"/>
+          <w:szCs w:val="28"/>
+        </w:rPr>
         <w:t>All connections were secured using the holders.</w:t>
       </w:r>
     </w:p>
@@ -557,12 +767,17 @@
           <w:ilvl w:val="0"/>
           <w:numId w:val="5"/>
         </w:numPr>
-      </w:pPr>
-      <w:r>
-        <w:t xml:space="preserve">We connected the switch between the battery and the series circuit path, then turned it on. The LEDs and the </w:t>
-      </w:r>
-      <w:r>
-        <w:t>buzzer turned on.</w:t>
+        <w:rPr>
+          <w:sz w:val="28"/>
+          <w:szCs w:val="28"/>
+        </w:rPr>
+      </w:pPr>
+      <w:r>
+        <w:rPr>
+          <w:sz w:val="28"/>
+          <w:szCs w:val="28"/>
+        </w:rPr>
+        <w:t>We connected the switch between the battery and the series circuit path, then turned it on. The LEDs and the buzzer turned on.</w:t>
       </w:r>
     </w:p>
     <w:p>
@@ -572,106 +787,158 @@
           <w:ilvl w:val="0"/>
           <w:numId w:val="5"/>
         </w:numPr>
-      </w:pPr>
-      <w:r>
+        <w:rPr>
+          <w:sz w:val="28"/>
+          <w:szCs w:val="28"/>
+        </w:rPr>
+      </w:pPr>
+      <w:r>
+        <w:rPr>
+          <w:sz w:val="28"/>
+          <w:szCs w:val="28"/>
+        </w:rPr>
         <w:t>We removed one component and noticed that the entire circuit stopped working.</w:t>
       </w:r>
     </w:p>
     <w:p>
       <w:pPr>
         <w:pStyle w:val="Heading4"/>
-      </w:pPr>
-      <w:bookmarkStart w:id="10" w:name="observation-and-conclusion-1"/>
+        <w:rPr>
+          <w:sz w:val="28"/>
+          <w:szCs w:val="28"/>
+        </w:rPr>
+      </w:pPr>
+      <w:bookmarkStart w:id="9" w:name="observation-and-conclusion-1"/>
+      <w:bookmarkEnd w:id="8"/>
+      <w:r>
+        <w:rPr>
+          <w:sz w:val="28"/>
+          <w:szCs w:val="28"/>
+        </w:rPr>
+        <w:t>🔹 Observation and Conclusion</w:t>
+      </w:r>
+    </w:p>
+    <w:p>
+      <w:pPr>
+        <w:pStyle w:val="FirstParagraph"/>
+        <w:rPr>
+          <w:sz w:val="28"/>
+          <w:szCs w:val="28"/>
+        </w:rPr>
+      </w:pPr>
+      <w:r>
+        <w:rPr>
+          <w:sz w:val="28"/>
+          <w:szCs w:val="28"/>
+        </w:rPr>
+        <w:t>We observed that all components in the series circuit received power, but shared the voltage. The LEDs glowed dimmer and the buzzer made a lower sound. When one component was removed, the entire circuit stopped working. This demonstrated that in a series circuit, components are dependent on each other.</w:t>
+      </w:r>
+    </w:p>
+    <w:p>
+      <w:pPr>
+        <w:pStyle w:val="BodyText"/>
+      </w:pPr>
+    </w:p>
+    <w:p>
+      <w:pPr>
+        <w:pStyle w:val="BodyText"/>
+      </w:pPr>
+      <w:bookmarkStart w:id="10" w:name="_GoBack"/>
+      <w:bookmarkEnd w:id="10"/>
+    </w:p>
+    <w:p>
+      <w:pPr>
+        <w:pStyle w:val="Heading3"/>
+      </w:pPr>
+      <w:bookmarkStart w:id="11" w:name="parallel-circuit"/>
+      <w:bookmarkEnd w:id="5"/>
       <w:bookmarkEnd w:id="9"/>
       <w:r>
-        <w:t>🔹</w:t>
-      </w:r>
-      <w:r>
-        <w:t xml:space="preserve"> Observation and Conclusion</w:t>
+        <w:lastRenderedPageBreak/>
+        <w:t>📘 3. Parallel Circuit</w:t>
       </w:r>
     </w:p>
     <w:p>
       <w:pPr>
         <w:pStyle w:val="FirstParagraph"/>
-      </w:pPr>
-      <w:r>
-        <w:t>We observed that all components in the series circuit received power, but shared the voltage. The LEDs glowed dimmer and the buzze</w:t>
-      </w:r>
-      <w:r>
-        <w:t>r made a lower sound. When one component was removed, the entire circuit stopped working. This demonstrated that in a series circuit, components are dependent on each other.</w:t>
-      </w:r>
-    </w:p>
-    <w:p>
-      <w:r>
-        <w:pict>
-          <v:rect id="_x0000_i1026" style="width:0;height:1.5pt" o:hralign="center" o:hrstd="t" o:hr="t"/>
-        </w:pict>
-      </w:r>
-    </w:p>
-    <w:p>
-      <w:pPr>
-        <w:pStyle w:val="Heading3"/>
-      </w:pPr>
-      <w:bookmarkStart w:id="11" w:name="parallel-circuit"/>
-      <w:bookmarkEnd w:id="6"/>
-      <w:bookmarkEnd w:id="10"/>
-      <w:r>
-        <w:t>📘</w:t>
-      </w:r>
-      <w:r>
-        <w:t xml:space="preserve"> 3. Parallel Circuit</w:t>
+        <w:rPr>
+          <w:sz w:val="28"/>
+          <w:szCs w:val="28"/>
+        </w:rPr>
+      </w:pPr>
+      <w:r>
+        <w:rPr>
+          <w:sz w:val="28"/>
+          <w:szCs w:val="28"/>
+        </w:rPr>
+        <w:t>Good Morning/Good Afternoon,</w:t>
+      </w:r>
+    </w:p>
+    <w:p>
+      <w:pPr>
+        <w:pStyle w:val="BodyText"/>
+        <w:rPr>
+          <w:sz w:val="28"/>
+          <w:szCs w:val="28"/>
+        </w:rPr>
+      </w:pPr>
+      <w:r>
+        <w:rPr>
+          <w:sz w:val="28"/>
+          <w:szCs w:val="28"/>
+        </w:rPr>
+        <w:t>My name is {Student Name} of 4th {Section}. Today, I am going to explain my project titled ‘Parallel Circuit’.</w:t>
+      </w:r>
+    </w:p>
+    <w:p>
+      <w:pPr>
+        <w:pStyle w:val="Heading4"/>
+        <w:rPr>
+          <w:sz w:val="28"/>
+          <w:szCs w:val="28"/>
+        </w:rPr>
+      </w:pPr>
+      <w:bookmarkStart w:id="12" w:name="introduction-2"/>
+      <w:r>
+        <w:rPr>
+          <w:sz w:val="28"/>
+          <w:szCs w:val="28"/>
+        </w:rPr>
+        <w:t>🔹 Introduction</w:t>
       </w:r>
     </w:p>
     <w:p>
       <w:pPr>
         <w:pStyle w:val="FirstParagraph"/>
-      </w:pPr>
-      <w:r>
-        <w:t>Good Morning/Good Afternoon,</w:t>
-      </w:r>
-    </w:p>
-    <w:p>
-      <w:pPr>
-        <w:pStyle w:val="BodyText"/>
-      </w:pPr>
-      <w:r>
-        <w:t>My name is {Student Name} of 4th {Section}. Today, I am going to explain my project titled ‘Parallel Circuit’.</w:t>
+        <w:rPr>
+          <w:sz w:val="28"/>
+          <w:szCs w:val="28"/>
+        </w:rPr>
+      </w:pPr>
+      <w:r>
+        <w:rPr>
+          <w:sz w:val="28"/>
+          <w:szCs w:val="28"/>
+        </w:rPr>
+        <w:t>In this project, we constructed a parallel circuit. This allowed us to explore how electric current behaves when multiple paths are available, and how each path operates independently.</w:t>
       </w:r>
     </w:p>
     <w:p>
       <w:pPr>
         <w:pStyle w:val="Heading4"/>
-      </w:pPr>
-      <w:bookmarkStart w:id="12" w:name="introduction-2"/>
-      <w:r>
-        <w:t>🔹</w:t>
-      </w:r>
-      <w:r>
-        <w:t xml:space="preserve"> Introduction</w:t>
-      </w:r>
-    </w:p>
-    <w:p>
-      <w:pPr>
-        <w:pStyle w:val="FirstParagraph"/>
-      </w:pPr>
-      <w:r>
-        <w:t>In this project, we constructed a parallel circuit. This allowed us to explore how electric current behaves when multiple paths a</w:t>
-      </w:r>
-      <w:r>
-        <w:t>re available, and how each path operates independently.</w:t>
-      </w:r>
-    </w:p>
-    <w:p>
-      <w:pPr>
-        <w:pStyle w:val="Heading4"/>
+        <w:rPr>
+          <w:sz w:val="28"/>
+          <w:szCs w:val="28"/>
+        </w:rPr>
       </w:pPr>
       <w:bookmarkStart w:id="13" w:name="components-used-2"/>
       <w:bookmarkEnd w:id="12"/>
       <w:r>
-        <w:t>🔹</w:t>
-      </w:r>
-      <w:r>
-        <w:t xml:space="preserve"> Components Used</w:t>
+        <w:rPr>
+          <w:sz w:val="28"/>
+          <w:szCs w:val="28"/>
+        </w:rPr>
+        <w:t>🔹 Components Used</w:t>
       </w:r>
     </w:p>
     <w:p>
@@ -681,8 +948,16 @@
           <w:ilvl w:val="0"/>
           <w:numId w:val="6"/>
         </w:numPr>
-      </w:pPr>
-      <w:r>
+        <w:rPr>
+          <w:sz w:val="28"/>
+          <w:szCs w:val="28"/>
+        </w:rPr>
+      </w:pPr>
+      <w:r>
+        <w:rPr>
+          <w:sz w:val="28"/>
+          <w:szCs w:val="28"/>
+        </w:rPr>
         <w:t>1 Battery</w:t>
       </w:r>
     </w:p>
@@ -693,8 +968,16 @@
           <w:ilvl w:val="0"/>
           <w:numId w:val="6"/>
         </w:numPr>
-      </w:pPr>
-      <w:r>
+        <w:rPr>
+          <w:sz w:val="28"/>
+          <w:szCs w:val="28"/>
+        </w:rPr>
+      </w:pPr>
+      <w:r>
+        <w:rPr>
+          <w:sz w:val="28"/>
+          <w:szCs w:val="28"/>
+        </w:rPr>
         <w:t>1 Switch</w:t>
       </w:r>
     </w:p>
@@ -705,8 +988,16 @@
           <w:ilvl w:val="0"/>
           <w:numId w:val="6"/>
         </w:numPr>
-      </w:pPr>
-      <w:r>
+        <w:rPr>
+          <w:sz w:val="28"/>
+          <w:szCs w:val="28"/>
+        </w:rPr>
+      </w:pPr>
+      <w:r>
+        <w:rPr>
+          <w:sz w:val="28"/>
+          <w:szCs w:val="28"/>
+        </w:rPr>
         <w:t>2 LEDs</w:t>
       </w:r>
     </w:p>
@@ -717,9 +1008,16 @@
           <w:ilvl w:val="0"/>
           <w:numId w:val="6"/>
         </w:numPr>
-      </w:pPr>
-      <w:r>
-        <w:lastRenderedPageBreak/>
+        <w:rPr>
+          <w:sz w:val="28"/>
+          <w:szCs w:val="28"/>
+        </w:rPr>
+      </w:pPr>
+      <w:r>
+        <w:rPr>
+          <w:sz w:val="28"/>
+          <w:szCs w:val="28"/>
+        </w:rPr>
         <w:t>1 Small DC Motor with Fan</w:t>
       </w:r>
     </w:p>
@@ -730,8 +1028,16 @@
           <w:ilvl w:val="0"/>
           <w:numId w:val="6"/>
         </w:numPr>
-      </w:pPr>
-      <w:r>
+        <w:rPr>
+          <w:sz w:val="28"/>
+          <w:szCs w:val="28"/>
+        </w:rPr>
+      </w:pPr>
+      <w:r>
+        <w:rPr>
+          <w:sz w:val="28"/>
+          <w:szCs w:val="28"/>
+        </w:rPr>
         <w:t>1 Buzzer</w:t>
       </w:r>
     </w:p>
@@ -742,22 +1048,35 @@
           <w:ilvl w:val="0"/>
           <w:numId w:val="6"/>
         </w:numPr>
-      </w:pPr>
-      <w:r>
+        <w:rPr>
+          <w:sz w:val="28"/>
+          <w:szCs w:val="28"/>
+        </w:rPr>
+      </w:pPr>
+      <w:r>
+        <w:rPr>
+          <w:sz w:val="28"/>
+          <w:szCs w:val="28"/>
+        </w:rPr>
         <w:t>1 Base board with holders</w:t>
       </w:r>
     </w:p>
     <w:p>
       <w:pPr>
         <w:pStyle w:val="Heading4"/>
+        <w:rPr>
+          <w:sz w:val="28"/>
+          <w:szCs w:val="28"/>
+        </w:rPr>
       </w:pPr>
       <w:bookmarkStart w:id="14" w:name="building-procedure-2"/>
       <w:bookmarkEnd w:id="13"/>
       <w:r>
-        <w:t>🔹</w:t>
-      </w:r>
-      <w:r>
-        <w:t xml:space="preserve"> Building Procedure</w:t>
+        <w:rPr>
+          <w:sz w:val="28"/>
+          <w:szCs w:val="28"/>
+        </w:rPr>
+        <w:t>🔹 Building Procedure</w:t>
       </w:r>
     </w:p>
     <w:p>
@@ -767,8 +1086,16 @@
           <w:ilvl w:val="0"/>
           <w:numId w:val="7"/>
         </w:numPr>
-      </w:pPr>
-      <w:r>
+        <w:rPr>
+          <w:sz w:val="28"/>
+          <w:szCs w:val="28"/>
+        </w:rPr>
+      </w:pPr>
+      <w:r>
+        <w:rPr>
+          <w:sz w:val="28"/>
+          <w:szCs w:val="28"/>
+        </w:rPr>
         <w:t>We inserted the battery into its holder on the base board.</w:t>
       </w:r>
     </w:p>
@@ -779,8 +1106,16 @@
           <w:ilvl w:val="0"/>
           <w:numId w:val="7"/>
         </w:numPr>
-      </w:pPr>
-      <w:r>
+        <w:rPr>
+          <w:sz w:val="28"/>
+          <w:szCs w:val="28"/>
+        </w:rPr>
+      </w:pPr>
+      <w:r>
+        <w:rPr>
+          <w:sz w:val="28"/>
+          <w:szCs w:val="28"/>
+        </w:rPr>
         <w:t>We connected two LEDs in parallel branches.</w:t>
       </w:r>
     </w:p>
@@ -791,8 +1126,16 @@
           <w:ilvl w:val="0"/>
           <w:numId w:val="7"/>
         </w:numPr>
-      </w:pPr>
-      <w:r>
+        <w:rPr>
+          <w:sz w:val="28"/>
+          <w:szCs w:val="28"/>
+        </w:rPr>
+      </w:pPr>
+      <w:r>
+        <w:rPr>
+          <w:sz w:val="28"/>
+          <w:szCs w:val="28"/>
+        </w:rPr>
         <w:t>We connected the small DC motor with fan in its own parallel path.</w:t>
       </w:r>
     </w:p>
@@ -803,8 +1146,16 @@
           <w:ilvl w:val="0"/>
           <w:numId w:val="7"/>
         </w:numPr>
-      </w:pPr>
-      <w:r>
+        <w:rPr>
+          <w:sz w:val="28"/>
+          <w:szCs w:val="28"/>
+        </w:rPr>
+      </w:pPr>
+      <w:r>
+        <w:rPr>
+          <w:sz w:val="28"/>
+          <w:szCs w:val="28"/>
+        </w:rPr>
         <w:t>We connected the buzzer in another parallel branch.</w:t>
       </w:r>
     </w:p>
@@ -815,8 +1166,16 @@
           <w:ilvl w:val="0"/>
           <w:numId w:val="7"/>
         </w:numPr>
-      </w:pPr>
-      <w:r>
+        <w:rPr>
+          <w:sz w:val="28"/>
+          <w:szCs w:val="28"/>
+        </w:rPr>
+      </w:pPr>
+      <w:r>
+        <w:rPr>
+          <w:sz w:val="28"/>
+          <w:szCs w:val="28"/>
+        </w:rPr>
         <w:t>Each component had its own direct connection to the battery.</w:t>
       </w:r>
     </w:p>
@@ -827,12 +1186,17 @@
           <w:ilvl w:val="0"/>
           <w:numId w:val="7"/>
         </w:numPr>
-      </w:pPr>
-      <w:r>
-        <w:t xml:space="preserve">We connected the switch between </w:t>
-      </w:r>
-      <w:r>
-        <w:t>the battery and the parallel paths, then turned it on.</w:t>
+        <w:rPr>
+          <w:sz w:val="28"/>
+          <w:szCs w:val="28"/>
+        </w:rPr>
+      </w:pPr>
+      <w:r>
+        <w:rPr>
+          <w:sz w:val="28"/>
+          <w:szCs w:val="28"/>
+        </w:rPr>
+        <w:t>We connected the switch between the battery and the parallel paths, then turned it on.</w:t>
       </w:r>
     </w:p>
     <w:p>
@@ -842,8 +1206,16 @@
           <w:ilvl w:val="0"/>
           <w:numId w:val="7"/>
         </w:numPr>
-      </w:pPr>
-      <w:r>
+        <w:rPr>
+          <w:sz w:val="28"/>
+          <w:szCs w:val="28"/>
+        </w:rPr>
+      </w:pPr>
+      <w:r>
+        <w:rPr>
+          <w:sz w:val="28"/>
+          <w:szCs w:val="28"/>
+        </w:rPr>
         <w:t>All components operated independently: the LEDs lit up, the motor fan spun, and the buzzer made sound.</w:t>
       </w:r>
     </w:p>
@@ -854,55 +1226,51 @@
           <w:ilvl w:val="0"/>
           <w:numId w:val="7"/>
         </w:numPr>
-      </w:pPr>
-      <w:r>
+        <w:rPr>
+          <w:sz w:val="28"/>
+          <w:szCs w:val="28"/>
+        </w:rPr>
+      </w:pPr>
+      <w:r>
+        <w:rPr>
+          <w:sz w:val="28"/>
+          <w:szCs w:val="28"/>
+        </w:rPr>
         <w:t>We removed one component and observed that others continued to function.</w:t>
       </w:r>
     </w:p>
     <w:p>
       <w:pPr>
         <w:pStyle w:val="Heading4"/>
+        <w:rPr>
+          <w:sz w:val="28"/>
+          <w:szCs w:val="28"/>
+        </w:rPr>
       </w:pPr>
       <w:bookmarkStart w:id="15" w:name="observation-and-conclusion-2"/>
       <w:bookmarkEnd w:id="14"/>
       <w:r>
-        <w:t>🔹</w:t>
-      </w:r>
-      <w:r>
-        <w:t xml:space="preserve"> Observation and Conclu</w:t>
-      </w:r>
-      <w:r>
-        <w:t>sion</w:t>
+        <w:rPr>
+          <w:sz w:val="28"/>
+          <w:szCs w:val="28"/>
+        </w:rPr>
+        <w:t>🔹 Observation and Conclusion</w:t>
       </w:r>
     </w:p>
     <w:p>
       <w:pPr>
         <w:pStyle w:val="FirstParagraph"/>
-      </w:pPr>
-      <w:r>
-        <w:t>We observed that each component in the parallel circuit received full power from the battery. All components worked at full strength. Removing one component did not affect the others. This demonstrated that parallel circuits allow components to operat</w:t>
-      </w:r>
-      <w:r>
-        <w:t>e independently, making them suitable for systems where reliability is important, like home lighting.</w:t>
-      </w:r>
-    </w:p>
-    <w:p>
-      <w:r>
-        <w:pict>
-          <v:rect id="_x0000_i1027" style="width:0;height:1.5pt" o:hralign="center" o:hrstd="t" o:hr="t"/>
-        </w:pict>
-      </w:r>
-    </w:p>
-    <w:p>
-      <w:pPr>
-        <w:pStyle w:val="FirstParagraph"/>
-      </w:pPr>
-      <w:r>
-        <w:rPr>
-          <w:b/>
-          <w:bCs/>
-        </w:rPr>
-        <w:t>End of Project</w:t>
+        <w:rPr>
+          <w:sz w:val="28"/>
+          <w:szCs w:val="28"/>
+        </w:rPr>
+      </w:pPr>
+      <w:r>
+        <w:rPr>
+          <w:sz w:val="28"/>
+          <w:szCs w:val="28"/>
+        </w:rPr>
+        <w:t>We observed that each component in the parallel circuit received full power from the battery. All components worked at full strength. Removing one component did not affect the others. This demonstrated that parallel circuits allow components to operate independently, making them suitable for systems where reliability is important, like home lighting.</w:t>
       </w:r>
       <w:bookmarkEnd w:id="11"/>
       <w:bookmarkEnd w:id="15"/>
@@ -3572,7 +3940,7 @@
   <a:extraClrSchemeLst/>
   <a:extLst>
     <a:ext uri="{05A4C25C-085E-4340-85A3-A5531E510DB2}">
-      <thm15:themeFamily xmlns:thm15="http://schemas.microsoft.com/office/thememl/2012/main" xmlns="" name="Office Theme" id="{2E142A2C-CD16-42D6-873A-C26D2A0506FA}" vid="{1BDDFF52-6CD6-40A5-AB3C-68EB2F1E4D0A}"/>
+      <thm15:themeFamily xmlns="" xmlns:thm15="http://schemas.microsoft.com/office/thememl/2012/main" name="Office Theme" id="{2E142A2C-CD16-42D6-873A-C26D2A0506FA}" vid="{1BDDFF52-6CD6-40A5-AB3C-68EB2F1E4D0A}"/>
     </a:ext>
   </a:extLst>
 </a:theme>

</xml_diff>

<commit_message>
removed the old and updated the circuits word dcument in the electronics
</commit_message>
<xml_diff>
--- a/Electronics/Circuit Documentation Kids Kit - for merge.docx
+++ b/Electronics/Circuit Documentation Kids Kit - for merge.docx
@@ -843,18 +843,25 @@
       <w:pPr>
         <w:pStyle w:val="BodyText"/>
       </w:pPr>
-      <w:bookmarkStart w:id="10" w:name="_GoBack"/>
-      <w:bookmarkEnd w:id="10"/>
+    </w:p>
+    <w:p>
+      <w:pPr>
+        <w:pStyle w:val="BodyText"/>
+      </w:pPr>
+    </w:p>
+    <w:p>
+      <w:pPr>
+        <w:pStyle w:val="BodyText"/>
+      </w:pPr>
     </w:p>
     <w:p>
       <w:pPr>
         <w:pStyle w:val="Heading3"/>
       </w:pPr>
-      <w:bookmarkStart w:id="11" w:name="parallel-circuit"/>
+      <w:bookmarkStart w:id="10" w:name="parallel-circuit"/>
       <w:bookmarkEnd w:id="5"/>
       <w:bookmarkEnd w:id="9"/>
       <w:r>
-        <w:lastRenderedPageBreak/>
         <w:t>📘 3. Parallel Circuit</w:t>
       </w:r>
     </w:p>
@@ -898,7 +905,7 @@
           <w:szCs w:val="28"/>
         </w:rPr>
       </w:pPr>
-      <w:bookmarkStart w:id="12" w:name="introduction-2"/>
+      <w:bookmarkStart w:id="11" w:name="introduction-2"/>
       <w:r>
         <w:rPr>
           <w:sz w:val="28"/>
@@ -931,8 +938,8 @@
           <w:szCs w:val="28"/>
         </w:rPr>
       </w:pPr>
-      <w:bookmarkStart w:id="13" w:name="components-used-2"/>
-      <w:bookmarkEnd w:id="12"/>
+      <w:bookmarkStart w:id="12" w:name="components-used-2"/>
+      <w:bookmarkEnd w:id="11"/>
       <w:r>
         <w:rPr>
           <w:sz w:val="28"/>
@@ -1069,8 +1076,8 @@
           <w:szCs w:val="28"/>
         </w:rPr>
       </w:pPr>
-      <w:bookmarkStart w:id="14" w:name="building-procedure-2"/>
-      <w:bookmarkEnd w:id="13"/>
+      <w:bookmarkStart w:id="13" w:name="building-procedure-2"/>
+      <w:bookmarkEnd w:id="12"/>
       <w:r>
         <w:rPr>
           <w:sz w:val="28"/>
@@ -1247,33 +1254,896 @@
           <w:szCs w:val="28"/>
         </w:rPr>
       </w:pPr>
-      <w:bookmarkStart w:id="15" w:name="observation-and-conclusion-2"/>
+      <w:bookmarkStart w:id="14" w:name="observation-and-conclusion-2"/>
+      <w:bookmarkEnd w:id="13"/>
+      <w:r>
+        <w:rPr>
+          <w:sz w:val="28"/>
+          <w:szCs w:val="28"/>
+        </w:rPr>
+        <w:t>🔹 Observation and Conclusion</w:t>
+      </w:r>
+    </w:p>
+    <w:p>
+      <w:pPr>
+        <w:pStyle w:val="FirstParagraph"/>
+        <w:rPr>
+          <w:sz w:val="28"/>
+          <w:szCs w:val="28"/>
+        </w:rPr>
+      </w:pPr>
+      <w:r>
+        <w:rPr>
+          <w:sz w:val="28"/>
+          <w:szCs w:val="28"/>
+        </w:rPr>
+        <w:t>We observed that each component in the parallel circuit received full power from the battery. All components worked at full strength. Removing one component did not affect the others. This demonstrated that parallel circuits allow components to operate independently, making them suitable for systems where reliability is important, like home lighting.</w:t>
+      </w:r>
+      <w:bookmarkEnd w:id="10"/>
       <w:bookmarkEnd w:id="14"/>
-      <w:r>
-        <w:rPr>
-          <w:sz w:val="28"/>
-          <w:szCs w:val="28"/>
-        </w:rPr>
-        <w:t>🔹 Observation and Conclusion</w:t>
-      </w:r>
-    </w:p>
-    <w:p>
-      <w:pPr>
-        <w:pStyle w:val="FirstParagraph"/>
-        <w:rPr>
-          <w:sz w:val="28"/>
-          <w:szCs w:val="28"/>
-        </w:rPr>
-      </w:pPr>
-      <w:r>
-        <w:rPr>
-          <w:sz w:val="28"/>
-          <w:szCs w:val="28"/>
-        </w:rPr>
-        <w:t>We observed that each component in the parallel circuit received full power from the battery. All components worked at full strength. Removing one component did not affect the others. This demonstrated that parallel circuits allow components to operate independently, making them suitable for systems where reliability is important, like home lighting.</w:t>
-      </w:r>
-      <w:bookmarkEnd w:id="11"/>
+    </w:p>
+    <w:p>
+      <w:pPr>
+        <w:pStyle w:val="Heading2"/>
+        <w:rPr>
+          <w:sz w:val="56"/>
+          <w:szCs w:val="56"/>
+        </w:rPr>
+      </w:pPr>
+      <w:r>
+        <w:rPr>
+          <w:rStyle w:val="Strong"/>
+          <w:b w:val="0"/>
+          <w:bCs w:val="0"/>
+          <w:sz w:val="56"/>
+          <w:szCs w:val="56"/>
+        </w:rPr>
+        <w:lastRenderedPageBreak/>
+        <w:t>4.</w:t>
+      </w:r>
+      <w:bookmarkStart w:id="15" w:name="_GoBack"/>
       <w:bookmarkEnd w:id="15"/>
+      <w:r>
+        <w:rPr>
+          <w:rStyle w:val="Strong"/>
+          <w:b w:val="0"/>
+          <w:bCs w:val="0"/>
+          <w:sz w:val="56"/>
+          <w:szCs w:val="56"/>
+        </w:rPr>
+        <w:t>House wiring:</w:t>
+      </w:r>
+    </w:p>
+    <w:p>
+      <w:pPr>
+        <w:pStyle w:val="Heading3"/>
+        <w:rPr>
+          <w:rStyle w:val="Strong"/>
+          <w:b w:val="0"/>
+          <w:bCs w:val="0"/>
+        </w:rPr>
+      </w:pPr>
+      <w:r>
+        <w:rPr>
+          <w:rStyle w:val="Strong"/>
+          <w:b w:val="0"/>
+          <w:bCs w:val="0"/>
+        </w:rPr>
+        <w:t>Introduction</w:t>
+      </w:r>
+    </w:p>
+    <w:p>
+      <w:pPr>
+        <w:pStyle w:val="Heading2"/>
+        <w:rPr>
+          <w:sz w:val="28"/>
+          <w:szCs w:val="28"/>
+        </w:rPr>
+      </w:pPr>
+      <w:r>
+        <w:rPr>
+          <w:rStyle w:val="Strong"/>
+          <w:b w:val="0"/>
+          <w:bCs w:val="0"/>
+          <w:sz w:val="28"/>
+          <w:szCs w:val="28"/>
+        </w:rPr>
+        <w:t>Good Morning / Good Afternoon to Parents and Teachers</w:t>
+      </w:r>
+    </w:p>
+    <w:p>
+      <w:pPr>
+        <w:pStyle w:val="NormalWeb"/>
+      </w:pPr>
+      <w:r>
+        <w:t xml:space="preserve">I am a student of </w:t>
+      </w:r>
+      <w:r>
+        <w:rPr>
+          <w:rStyle w:val="Strong"/>
+        </w:rPr>
+        <w:t>Grade 4</w:t>
+      </w:r>
+      <w:r>
+        <w:t xml:space="preserve">, and today I am going to explain and demonstrate my project on </w:t>
+      </w:r>
+      <w:r>
+        <w:rPr>
+          <w:rStyle w:val="Strong"/>
+        </w:rPr>
+        <w:t>House Wiring Connections</w:t>
+      </w:r>
+      <w:r>
+        <w:t>.</w:t>
+      </w:r>
+      <w:r>
+        <w:br/>
+        <w:t>Electricity is very important in our daily life. It helps us to light our homes, run fans, TVs, fridges, and many other appliances.</w:t>
+      </w:r>
+      <w:r>
+        <w:br/>
+        <w:t xml:space="preserve">In house wiring, we use both </w:t>
+      </w:r>
+      <w:r>
+        <w:rPr>
+          <w:rStyle w:val="Strong"/>
+        </w:rPr>
+        <w:t>series</w:t>
+      </w:r>
+      <w:r>
+        <w:t xml:space="preserve"> and </w:t>
+      </w:r>
+      <w:r>
+        <w:rPr>
+          <w:rStyle w:val="Strong"/>
+        </w:rPr>
+        <w:t>parallel connections</w:t>
+      </w:r>
+      <w:r>
+        <w:t xml:space="preserve"> based on our needs.</w:t>
+      </w:r>
+      <w:r>
+        <w:br/>
+        <w:t xml:space="preserve">Most of the time, about </w:t>
+      </w:r>
+      <w:r>
+        <w:rPr>
+          <w:rStyle w:val="Strong"/>
+        </w:rPr>
+        <w:t>90% of house wiring</w:t>
+      </w:r>
+      <w:r>
+        <w:t xml:space="preserve"> is done using </w:t>
+      </w:r>
+      <w:r>
+        <w:rPr>
+          <w:rStyle w:val="Strong"/>
+        </w:rPr>
+        <w:t>parallel connections</w:t>
+      </w:r>
+      <w:r>
+        <w:t xml:space="preserve">, while </w:t>
+      </w:r>
+      <w:r>
+        <w:rPr>
+          <w:rStyle w:val="Strong"/>
+        </w:rPr>
+        <w:t>series connections</w:t>
+      </w:r>
+      <w:r>
+        <w:t xml:space="preserve"> are used only in some special cases.</w:t>
+      </w:r>
+      <w:r>
+        <w:br/>
+        <w:t>Through this project, I will show how both types of wiring work and where they are used.</w:t>
+      </w:r>
+    </w:p>
+    <w:p>
+      <w:pPr>
+        <w:pStyle w:val="Heading3"/>
+      </w:pPr>
+      <w:r>
+        <w:rPr>
+          <w:rStyle w:val="Strong"/>
+          <w:b w:val="0"/>
+          <w:bCs w:val="0"/>
+        </w:rPr>
+        <w:t>Aim</w:t>
+      </w:r>
+    </w:p>
+    <w:p>
+      <w:pPr>
+        <w:pStyle w:val="NormalWeb"/>
+      </w:pPr>
+      <w:r>
+        <w:t xml:space="preserve">To understand and demonstrate </w:t>
+      </w:r>
+      <w:r>
+        <w:rPr>
+          <w:rStyle w:val="Strong"/>
+        </w:rPr>
+        <w:t>house wiring connections</w:t>
+      </w:r>
+      <w:r>
+        <w:t xml:space="preserve"> using both </w:t>
+      </w:r>
+      <w:r>
+        <w:rPr>
+          <w:rStyle w:val="Strong"/>
+        </w:rPr>
+        <w:t>series</w:t>
+      </w:r>
+      <w:r>
+        <w:t xml:space="preserve"> and </w:t>
+      </w:r>
+      <w:r>
+        <w:rPr>
+          <w:rStyle w:val="Strong"/>
+        </w:rPr>
+        <w:t>parallel circuits</w:t>
+      </w:r>
+      <w:r>
+        <w:t xml:space="preserve"> with basic components such as </w:t>
+      </w:r>
+      <w:r>
+        <w:rPr>
+          <w:rStyle w:val="Strong"/>
+        </w:rPr>
+        <w:t>LEDs, switches, buzzers, fans (DC motor),</w:t>
+      </w:r>
+      <w:r>
+        <w:t xml:space="preserve"> and </w:t>
+      </w:r>
+      <w:r>
+        <w:rPr>
+          <w:rStyle w:val="Strong"/>
+        </w:rPr>
+        <w:t>batteries</w:t>
+      </w:r>
+      <w:r>
+        <w:t>.</w:t>
+      </w:r>
+    </w:p>
+    <w:p/>
+    <w:p>
+      <w:pPr>
+        <w:pStyle w:val="Heading3"/>
+      </w:pPr>
+      <w:r>
+        <w:rPr>
+          <w:rStyle w:val="Strong"/>
+          <w:b w:val="0"/>
+          <w:bCs w:val="0"/>
+        </w:rPr>
+        <w:t>Materials Required</w:t>
+      </w:r>
+    </w:p>
+    <w:p>
+      <w:pPr>
+        <w:pStyle w:val="NormalWeb"/>
+        <w:numPr>
+          <w:ilvl w:val="0"/>
+          <w:numId w:val="8"/>
+        </w:numPr>
+      </w:pPr>
+      <w:r>
+        <w:rPr>
+          <w:rStyle w:val="Strong"/>
+        </w:rPr>
+        <w:t>Component Holder:</w:t>
+      </w:r>
+      <w:r>
+        <w:t xml:space="preserve"> Holds the components like LEDs, buzzer, and fan (DC motor).</w:t>
+      </w:r>
+    </w:p>
+    <w:p>
+      <w:pPr>
+        <w:pStyle w:val="NormalWeb"/>
+        <w:numPr>
+          <w:ilvl w:val="0"/>
+          <w:numId w:val="8"/>
+        </w:numPr>
+      </w:pPr>
+      <w:r>
+        <w:rPr>
+          <w:rStyle w:val="Strong"/>
+        </w:rPr>
+        <w:t>Battery Holder:</w:t>
+      </w:r>
+      <w:r>
+        <w:t xml:space="preserve"> Holds the batteries and provides power to the circuit.</w:t>
+      </w:r>
+    </w:p>
+    <w:p>
+      <w:pPr>
+        <w:pStyle w:val="NormalWeb"/>
+        <w:numPr>
+          <w:ilvl w:val="0"/>
+          <w:numId w:val="8"/>
+        </w:numPr>
+      </w:pPr>
+      <w:r>
+        <w:rPr>
+          <w:rStyle w:val="Strong"/>
+        </w:rPr>
+        <w:t>Batteries:</w:t>
+      </w:r>
+      <w:r>
+        <w:t xml:space="preserve"> Source of electrical energy.</w:t>
+      </w:r>
+    </w:p>
+    <w:p>
+      <w:pPr>
+        <w:pStyle w:val="NormalWeb"/>
+        <w:numPr>
+          <w:ilvl w:val="0"/>
+          <w:numId w:val="8"/>
+        </w:numPr>
+      </w:pPr>
+      <w:r>
+        <w:rPr>
+          <w:rStyle w:val="Strong"/>
+        </w:rPr>
+        <w:t>Connection Pole:</w:t>
+      </w:r>
+      <w:r>
+        <w:t xml:space="preserve"> Used as a point to connect wires together.</w:t>
+      </w:r>
+    </w:p>
+    <w:p>
+      <w:pPr>
+        <w:pStyle w:val="NormalWeb"/>
+        <w:numPr>
+          <w:ilvl w:val="0"/>
+          <w:numId w:val="8"/>
+        </w:numPr>
+      </w:pPr>
+      <w:r>
+        <w:rPr>
+          <w:rStyle w:val="Strong"/>
+        </w:rPr>
+        <w:t>Wires:</w:t>
+      </w:r>
+      <w:r>
+        <w:t xml:space="preserve"> Connect all components to complete the circuit.</w:t>
+      </w:r>
+    </w:p>
+    <w:p>
+      <w:pPr>
+        <w:pStyle w:val="NormalWeb"/>
+        <w:numPr>
+          <w:ilvl w:val="0"/>
+          <w:numId w:val="8"/>
+        </w:numPr>
+      </w:pPr>
+      <w:r>
+        <w:rPr>
+          <w:rStyle w:val="Strong"/>
+        </w:rPr>
+        <w:t>Switch:</w:t>
+      </w:r>
+      <w:r>
+        <w:t xml:space="preserve"> Controls the flow of electricity.</w:t>
+      </w:r>
+    </w:p>
+    <w:p>
+      <w:pPr>
+        <w:pStyle w:val="NormalWeb"/>
+        <w:numPr>
+          <w:ilvl w:val="0"/>
+          <w:numId w:val="8"/>
+        </w:numPr>
+      </w:pPr>
+      <w:r>
+        <w:rPr>
+          <w:rStyle w:val="Strong"/>
+        </w:rPr>
+        <w:t>LED:</w:t>
+      </w:r>
+      <w:r>
+        <w:t xml:space="preserve"> Lights up when electricity passes through.</w:t>
+      </w:r>
+    </w:p>
+    <w:p>
+      <w:pPr>
+        <w:pStyle w:val="NormalWeb"/>
+        <w:numPr>
+          <w:ilvl w:val="0"/>
+          <w:numId w:val="8"/>
+        </w:numPr>
+      </w:pPr>
+      <w:r>
+        <w:rPr>
+          <w:rStyle w:val="Strong"/>
+        </w:rPr>
+        <w:t>Buzzer:</w:t>
+      </w:r>
+      <w:r>
+        <w:t xml:space="preserve"> Produces sound when electricity flows.</w:t>
+      </w:r>
+    </w:p>
+    <w:p>
+      <w:pPr>
+        <w:pStyle w:val="NormalWeb"/>
+        <w:numPr>
+          <w:ilvl w:val="0"/>
+          <w:numId w:val="8"/>
+        </w:numPr>
+      </w:pPr>
+      <w:r>
+        <w:rPr>
+          <w:rStyle w:val="Strong"/>
+        </w:rPr>
+        <w:t>Fan (DC Motor):</w:t>
+      </w:r>
+      <w:r>
+        <w:t xml:space="preserve"> Spins when powered, similar to a house fan.</w:t>
+      </w:r>
+    </w:p>
+    <w:p/>
+    <w:p>
+      <w:pPr>
+        <w:pStyle w:val="Heading3"/>
+      </w:pPr>
+      <w:r>
+        <w:rPr>
+          <w:rStyle w:val="Strong"/>
+          <w:b w:val="0"/>
+          <w:bCs w:val="0"/>
+        </w:rPr>
+        <w:t>What is Series and Parallel Wiring?</w:t>
+      </w:r>
+    </w:p>
+    <w:p>
+      <w:pPr>
+        <w:pStyle w:val="NormalWeb"/>
+      </w:pPr>
+      <w:r>
+        <w:rPr>
+          <w:rStyle w:val="Strong"/>
+        </w:rPr>
+        <w:t>Series Wiring:</w:t>
+      </w:r>
+      <w:r>
+        <w:br/>
+        <w:t xml:space="preserve">In a series connection, the components are connected </w:t>
+      </w:r>
+      <w:r>
+        <w:rPr>
+          <w:rStyle w:val="Strong"/>
+        </w:rPr>
+        <w:t>one after another</w:t>
+      </w:r>
+      <w:r>
+        <w:t xml:space="preserve"> in a single path.</w:t>
+      </w:r>
+      <w:r>
+        <w:br/>
+        <w:t xml:space="preserve">If one component stops working, the </w:t>
+      </w:r>
+      <w:r>
+        <w:rPr>
+          <w:rStyle w:val="Strong"/>
+        </w:rPr>
+        <w:t>entire circuit stops</w:t>
+      </w:r>
+      <w:r>
+        <w:t>.</w:t>
+      </w:r>
+      <w:r>
+        <w:br/>
+        <w:t xml:space="preserve">It is mostly used in things like </w:t>
+      </w:r>
+      <w:r>
+        <w:rPr>
+          <w:rStyle w:val="Strong"/>
+        </w:rPr>
+        <w:t>Christmas lights</w:t>
+      </w:r>
+      <w:r>
+        <w:t xml:space="preserve"> or </w:t>
+      </w:r>
+      <w:r>
+        <w:rPr>
+          <w:rStyle w:val="Strong"/>
+        </w:rPr>
+        <w:t>decoration lights</w:t>
+      </w:r>
+      <w:r>
+        <w:t>, where all bulbs glow together.</w:t>
+      </w:r>
+    </w:p>
+    <w:p>
+      <w:pPr>
+        <w:pStyle w:val="NormalWeb"/>
+      </w:pPr>
+      <w:r>
+        <w:rPr>
+          <w:rStyle w:val="Strong"/>
+        </w:rPr>
+        <w:lastRenderedPageBreak/>
+        <w:t>Parallel Wiring:</w:t>
+      </w:r>
+      <w:r>
+        <w:br/>
+        <w:t xml:space="preserve">In a parallel connection, each component has its </w:t>
+      </w:r>
+      <w:r>
+        <w:rPr>
+          <w:rStyle w:val="Strong"/>
+        </w:rPr>
+        <w:t>own separate path</w:t>
+      </w:r>
+      <w:r>
+        <w:t xml:space="preserve"> to the battery.</w:t>
+      </w:r>
+      <w:r>
+        <w:br/>
+        <w:t xml:space="preserve">If one device stops working, the </w:t>
+      </w:r>
+      <w:r>
+        <w:rPr>
+          <w:rStyle w:val="Strong"/>
+        </w:rPr>
+        <w:t>others still continue</w:t>
+      </w:r>
+      <w:r>
+        <w:t xml:space="preserve"> to work.</w:t>
+      </w:r>
+      <w:r>
+        <w:br/>
+        <w:t xml:space="preserve">This type of connection is used in </w:t>
+      </w:r>
+      <w:r>
+        <w:rPr>
+          <w:rStyle w:val="Strong"/>
+        </w:rPr>
+        <w:t>homes, schools, and offices</w:t>
+      </w:r>
+      <w:r>
+        <w:t xml:space="preserve"> to run lights, fans, and plugs independently.</w:t>
+      </w:r>
+    </w:p>
+    <w:p>
+      <w:pPr>
+        <w:pStyle w:val="Heading3"/>
+      </w:pPr>
+      <w:r>
+        <w:rPr>
+          <w:rStyle w:val="Strong"/>
+          <w:b w:val="0"/>
+          <w:bCs w:val="0"/>
+        </w:rPr>
+        <w:t>Steps to Create the House Wiring</w:t>
+      </w:r>
+    </w:p>
+    <w:p>
+      <w:pPr>
+        <w:pStyle w:val="NormalWeb"/>
+      </w:pPr>
+      <w:r>
+        <w:rPr>
+          <w:rStyle w:val="Strong"/>
+        </w:rPr>
+        <w:t>Step 1:</w:t>
+      </w:r>
+      <w:r>
+        <w:t xml:space="preserve"> Place the batteries inside the battery holder to supply power.</w:t>
+      </w:r>
+    </w:p>
+    <w:p>
+      <w:pPr>
+        <w:pStyle w:val="NormalWeb"/>
+      </w:pPr>
+      <w:r>
+        <w:rPr>
+          <w:rStyle w:val="Strong"/>
+        </w:rPr>
+        <w:t>Step 2:</w:t>
+      </w:r>
+      <w:r>
+        <w:t xml:space="preserve"> Connect the positive and negative ends of the battery holder to the connection pole using wires.</w:t>
+      </w:r>
+    </w:p>
+    <w:p>
+      <w:pPr>
+        <w:pStyle w:val="NormalWeb"/>
+      </w:pPr>
+      <w:r>
+        <w:rPr>
+          <w:rStyle w:val="Strong"/>
+        </w:rPr>
+        <w:t>Step 3:</w:t>
+      </w:r>
+      <w:r>
+        <w:t xml:space="preserve"> Attach a switch to one of the wires from the connection pole. The switch will control the power flow.</w:t>
+      </w:r>
+    </w:p>
+    <w:p>
+      <w:pPr>
+        <w:pStyle w:val="NormalWeb"/>
+      </w:pPr>
+      <w:r>
+        <w:rPr>
+          <w:rStyle w:val="Strong"/>
+        </w:rPr>
+        <w:t>Step 4:</w:t>
+      </w:r>
+      <w:r>
+        <w:t xml:space="preserve"> Connect components like </w:t>
+      </w:r>
+      <w:r>
+        <w:rPr>
+          <w:rStyle w:val="Strong"/>
+        </w:rPr>
+        <w:t>LED, buzzer, and fan</w:t>
+      </w:r>
+      <w:r>
+        <w:t xml:space="preserve"> in </w:t>
+      </w:r>
+      <w:r>
+        <w:rPr>
+          <w:rStyle w:val="Strong"/>
+        </w:rPr>
+        <w:t>parallel</w:t>
+      </w:r>
+      <w:r>
+        <w:t xml:space="preserve"> so that they work independently.</w:t>
+      </w:r>
+    </w:p>
+    <w:p>
+      <w:pPr>
+        <w:pStyle w:val="NormalWeb"/>
+      </w:pPr>
+      <w:r>
+        <w:rPr>
+          <w:rStyle w:val="Strong"/>
+        </w:rPr>
+        <w:t>Step 5:</w:t>
+      </w:r>
+      <w:r>
+        <w:t xml:space="preserve"> For understanding </w:t>
+      </w:r>
+      <w:r>
+        <w:rPr>
+          <w:rStyle w:val="Strong"/>
+        </w:rPr>
+        <w:t>series connection</w:t>
+      </w:r>
+      <w:r>
+        <w:t>, connect two LEDs one after another in a single line.</w:t>
+      </w:r>
+      <w:r>
+        <w:br/>
+        <w:t>If one LED is removed, the other will stop glowing — showing that they depend on each other.</w:t>
+      </w:r>
+    </w:p>
+    <w:p>
+      <w:pPr>
+        <w:pStyle w:val="NormalWeb"/>
+      </w:pPr>
+      <w:r>
+        <w:rPr>
+          <w:rStyle w:val="Strong"/>
+        </w:rPr>
+        <w:t>Step 6:</w:t>
+      </w:r>
+      <w:r>
+        <w:t xml:space="preserve"> Turn ON the switch and observe.</w:t>
+      </w:r>
+    </w:p>
+    <w:p>
+      <w:pPr>
+        <w:pStyle w:val="NormalWeb"/>
+        <w:numPr>
+          <w:ilvl w:val="0"/>
+          <w:numId w:val="9"/>
+        </w:numPr>
+      </w:pPr>
+      <w:r>
+        <w:t xml:space="preserve">In </w:t>
+      </w:r>
+      <w:r>
+        <w:rPr>
+          <w:rStyle w:val="Strong"/>
+        </w:rPr>
+        <w:t>parallel wiring</w:t>
+      </w:r>
+      <w:r>
+        <w:t>, the LED, buzzer, and fan will work even if one is removed.</w:t>
+      </w:r>
+    </w:p>
+    <w:p>
+      <w:pPr>
+        <w:pStyle w:val="NormalWeb"/>
+        <w:numPr>
+          <w:ilvl w:val="0"/>
+          <w:numId w:val="9"/>
+        </w:numPr>
+      </w:pPr>
+      <w:r>
+        <w:t xml:space="preserve">In </w:t>
+      </w:r>
+      <w:r>
+        <w:rPr>
+          <w:rStyle w:val="Strong"/>
+        </w:rPr>
+        <w:t>series wiring</w:t>
+      </w:r>
+      <w:r>
+        <w:t>, all will stop working if one is disconnected.</w:t>
+      </w:r>
+    </w:p>
+    <w:p>
+      <w:pPr>
+        <w:pStyle w:val="Heading3"/>
+      </w:pPr>
+      <w:r>
+        <w:rPr>
+          <w:rStyle w:val="Strong"/>
+          <w:b w:val="0"/>
+          <w:bCs w:val="0"/>
+        </w:rPr>
+        <w:t>Real-Life Examples</w:t>
+      </w:r>
+    </w:p>
+    <w:p>
+      <w:pPr>
+        <w:pStyle w:val="NormalWeb"/>
+        <w:numPr>
+          <w:ilvl w:val="0"/>
+          <w:numId w:val="10"/>
+        </w:numPr>
+      </w:pPr>
+      <w:r>
+        <w:rPr>
+          <w:rStyle w:val="Strong"/>
+        </w:rPr>
+        <w:t>Series Connection:</w:t>
+      </w:r>
+      <w:r>
+        <w:t xml:space="preserve"> Used in </w:t>
+      </w:r>
+      <w:r>
+        <w:rPr>
+          <w:rStyle w:val="Strong"/>
+        </w:rPr>
+        <w:t>Christmas lights</w:t>
+      </w:r>
+      <w:r>
+        <w:t xml:space="preserve">, </w:t>
+      </w:r>
+      <w:r>
+        <w:rPr>
+          <w:rStyle w:val="Strong"/>
+        </w:rPr>
+        <w:t>fairy lights</w:t>
+      </w:r>
+      <w:r>
+        <w:t xml:space="preserve">, and some </w:t>
+      </w:r>
+      <w:r>
+        <w:rPr>
+          <w:rStyle w:val="Strong"/>
+        </w:rPr>
+        <w:t>battery chains</w:t>
+      </w:r>
+      <w:r>
+        <w:t>.</w:t>
+      </w:r>
+    </w:p>
+    <w:p>
+      <w:pPr>
+        <w:pStyle w:val="NormalWeb"/>
+        <w:numPr>
+          <w:ilvl w:val="0"/>
+          <w:numId w:val="10"/>
+        </w:numPr>
+      </w:pPr>
+      <w:r>
+        <w:rPr>
+          <w:rStyle w:val="Strong"/>
+        </w:rPr>
+        <w:t>Parallel Connection:</w:t>
+      </w:r>
+      <w:r>
+        <w:t xml:space="preserve"> Used in </w:t>
+      </w:r>
+      <w:r>
+        <w:rPr>
+          <w:rStyle w:val="Strong"/>
+        </w:rPr>
+        <w:t>home wiring</w:t>
+      </w:r>
+      <w:r>
+        <w:t>, where lights, fans, and sockets work separately.</w:t>
+      </w:r>
+      <w:r>
+        <w:br/>
+        <w:t>For example, even if one bulb fuses, the fan will still run.</w:t>
+      </w:r>
+    </w:p>
+    <w:p>
+      <w:pPr>
+        <w:pStyle w:val="Heading3"/>
+      </w:pPr>
+      <w:r>
+        <w:rPr>
+          <w:rStyle w:val="Strong"/>
+          <w:b w:val="0"/>
+          <w:bCs w:val="0"/>
+        </w:rPr>
+        <w:t>Conclusion</w:t>
+      </w:r>
+    </w:p>
+    <w:p>
+      <w:pPr>
+        <w:pStyle w:val="NormalWeb"/>
+      </w:pPr>
+      <w:r>
+        <w:t xml:space="preserve">From this project, I learned that both </w:t>
+      </w:r>
+      <w:r>
+        <w:rPr>
+          <w:rStyle w:val="Strong"/>
+        </w:rPr>
+        <w:t>series</w:t>
+      </w:r>
+      <w:r>
+        <w:t xml:space="preserve"> and </w:t>
+      </w:r>
+      <w:r>
+        <w:rPr>
+          <w:rStyle w:val="Strong"/>
+        </w:rPr>
+        <w:t>parallel</w:t>
+      </w:r>
+      <w:r>
+        <w:t xml:space="preserve"> wiring are useful.</w:t>
+      </w:r>
+      <w:r>
+        <w:br/>
+        <w:t xml:space="preserve">However, </w:t>
+      </w:r>
+      <w:r>
+        <w:rPr>
+          <w:rStyle w:val="Strong"/>
+        </w:rPr>
+        <w:t>parallel wiring</w:t>
+      </w:r>
+      <w:r>
+        <w:t xml:space="preserve"> is mostly used in houses because it allows each device to work </w:t>
+      </w:r>
+      <w:r>
+        <w:rPr>
+          <w:rStyle w:val="Strong"/>
+        </w:rPr>
+        <w:t>independently</w:t>
+      </w:r>
+      <w:r>
+        <w:t xml:space="preserve"> and safely.</w:t>
+      </w:r>
+      <w:r>
+        <w:br/>
+      </w:r>
+      <w:r>
+        <w:rPr>
+          <w:rStyle w:val="Strong"/>
+        </w:rPr>
+        <w:t>Series wiring</w:t>
+      </w:r>
+      <w:r>
+        <w:t xml:space="preserve"> is used rarely, mainly for decoration or special purposes.</w:t>
+      </w:r>
+      <w:r>
+        <w:br/>
+        <w:t>This experiment helps us understand how electricity flows and powers different devices in our homes.</w:t>
+      </w:r>
+    </w:p>
+    <w:p>
+      <w:pPr>
+        <w:pStyle w:val="BodyText"/>
+      </w:pPr>
     </w:p>
     <w:sectPr>
       <w:footnotePr>
@@ -1285,6 +2155,56 @@
     </w:sectPr>
   </w:body>
 </w:document>
+</file>
+
+<file path=word/endnotes.xml><?xml version="1.0" encoding="utf-8"?>
+<w:endnotes xmlns:wpc="http://schemas.microsoft.com/office/word/2010/wordprocessingCanvas" xmlns:mc="http://schemas.openxmlformats.org/markup-compatibility/2006" xmlns:o="urn:schemas-microsoft-com:office:office" xmlns:r="http://schemas.openxmlformats.org/officeDocument/2006/relationships" xmlns:m="http://schemas.openxmlformats.org/officeDocument/2006/math" xmlns:v="urn:schemas-microsoft-com:vml" xmlns:wp14="http://schemas.microsoft.com/office/word/2010/wordprocessingDrawing" xmlns:wp="http://schemas.openxmlformats.org/drawingml/2006/wordprocessingDrawing" xmlns:w10="urn:schemas-microsoft-com:office:word" xmlns:w="http://schemas.openxmlformats.org/wordprocessingml/2006/main" xmlns:w14="http://schemas.microsoft.com/office/word/2010/wordml" xmlns:wpg="http://schemas.microsoft.com/office/word/2010/wordprocessingGroup" xmlns:wpi="http://schemas.microsoft.com/office/word/2010/wordprocessingInk" xmlns:wne="http://schemas.microsoft.com/office/word/2006/wordml" xmlns:wps="http://schemas.microsoft.com/office/word/2010/wordprocessingShape" mc:Ignorable="w14 wp14">
+  <w:endnote w:type="separator" w:id="-1">
+    <w:p>
+      <w:pPr>
+        <w:spacing w:after="0"/>
+      </w:pPr>
+      <w:r>
+        <w:separator/>
+      </w:r>
+    </w:p>
+  </w:endnote>
+  <w:endnote w:type="continuationSeparator" w:id="0">
+    <w:p>
+      <w:pPr>
+        <w:spacing w:after="0"/>
+      </w:pPr>
+      <w:r>
+        <w:continuationSeparator/>
+      </w:r>
+    </w:p>
+  </w:endnote>
+</w:endnotes>
+</file>
+
+<file path=word/footnotes.xml><?xml version="1.0" encoding="utf-8"?>
+<w:footnotes xmlns:wpc="http://schemas.microsoft.com/office/word/2010/wordprocessingCanvas" xmlns:mc="http://schemas.openxmlformats.org/markup-compatibility/2006" xmlns:o="urn:schemas-microsoft-com:office:office" xmlns:r="http://schemas.openxmlformats.org/officeDocument/2006/relationships" xmlns:m="http://schemas.openxmlformats.org/officeDocument/2006/math" xmlns:v="urn:schemas-microsoft-com:vml" xmlns:wp14="http://schemas.microsoft.com/office/word/2010/wordprocessingDrawing" xmlns:wp="http://schemas.openxmlformats.org/drawingml/2006/wordprocessingDrawing" xmlns:w10="urn:schemas-microsoft-com:office:word" xmlns:w="http://schemas.openxmlformats.org/wordprocessingml/2006/main" xmlns:w14="http://schemas.microsoft.com/office/word/2010/wordml" xmlns:wpg="http://schemas.microsoft.com/office/word/2010/wordprocessingGroup" xmlns:wpi="http://schemas.microsoft.com/office/word/2010/wordprocessingInk" xmlns:wne="http://schemas.microsoft.com/office/word/2006/wordml" xmlns:wps="http://schemas.microsoft.com/office/word/2010/wordprocessingShape" mc:Ignorable="w14 wp14">
+  <w:footnote w:type="separator" w:id="-1">
+    <w:p>
+      <w:pPr>
+        <w:spacing w:after="0"/>
+      </w:pPr>
+      <w:r>
+        <w:separator/>
+      </w:r>
+    </w:p>
+  </w:footnote>
+  <w:footnote w:type="continuationSeparator" w:id="0">
+    <w:p>
+      <w:pPr>
+        <w:spacing w:after="0"/>
+      </w:pPr>
+      <w:r>
+        <w:continuationSeparator/>
+      </w:r>
+    </w:p>
+  </w:footnote>
+</w:footnotes>
 </file>
 
 <file path=word/numbering.xml><?xml version="1.0" encoding="utf-8"?>
@@ -1552,6 +2472,417 @@
       <w:lvlText w:val="%9."/>
       <w:lvlJc w:val="left"/>
       <w:pPr>
+        <w:ind w:left="6480" w:hanging="360"/>
+      </w:pPr>
+    </w:lvl>
+  </w:abstractNum>
+  <w:abstractNum w:abstractNumId="3">
+    <w:nsid w:val="0110732B"/>
+    <w:multiLevelType w:val="multilevel"/>
+    <w:tmpl w:val="09A4443C"/>
+    <w:lvl w:ilvl="0">
+      <w:start w:val="1"/>
+      <w:numFmt w:val="bullet"/>
+      <w:lvlText w:val=""/>
+      <w:lvlJc w:val="left"/>
+      <w:pPr>
+        <w:tabs>
+          <w:tab w:val="num" w:pos="720"/>
+        </w:tabs>
+        <w:ind w:left="720" w:hanging="360"/>
+      </w:pPr>
+      <w:rPr>
+        <w:rFonts w:ascii="Symbol" w:hAnsi="Symbol" w:hint="default"/>
+        <w:sz w:val="20"/>
+      </w:rPr>
+    </w:lvl>
+    <w:lvl w:ilvl="1" w:tentative="1">
+      <w:start w:val="1"/>
+      <w:numFmt w:val="bullet"/>
+      <w:lvlText w:val="o"/>
+      <w:lvlJc w:val="left"/>
+      <w:pPr>
+        <w:tabs>
+          <w:tab w:val="num" w:pos="1440"/>
+        </w:tabs>
+        <w:ind w:left="1440" w:hanging="360"/>
+      </w:pPr>
+      <w:rPr>
+        <w:rFonts w:ascii="Courier New" w:hAnsi="Courier New" w:hint="default"/>
+        <w:sz w:val="20"/>
+      </w:rPr>
+    </w:lvl>
+    <w:lvl w:ilvl="2" w:tentative="1">
+      <w:start w:val="1"/>
+      <w:numFmt w:val="bullet"/>
+      <w:lvlText w:val=""/>
+      <w:lvlJc w:val="left"/>
+      <w:pPr>
+        <w:tabs>
+          <w:tab w:val="num" w:pos="2160"/>
+        </w:tabs>
+        <w:ind w:left="2160" w:hanging="360"/>
+      </w:pPr>
+      <w:rPr>
+        <w:rFonts w:ascii="Wingdings" w:hAnsi="Wingdings" w:hint="default"/>
+        <w:sz w:val="20"/>
+      </w:rPr>
+    </w:lvl>
+    <w:lvl w:ilvl="3" w:tentative="1">
+      <w:start w:val="1"/>
+      <w:numFmt w:val="bullet"/>
+      <w:lvlText w:val=""/>
+      <w:lvlJc w:val="left"/>
+      <w:pPr>
+        <w:tabs>
+          <w:tab w:val="num" w:pos="2880"/>
+        </w:tabs>
+        <w:ind w:left="2880" w:hanging="360"/>
+      </w:pPr>
+      <w:rPr>
+        <w:rFonts w:ascii="Wingdings" w:hAnsi="Wingdings" w:hint="default"/>
+        <w:sz w:val="20"/>
+      </w:rPr>
+    </w:lvl>
+    <w:lvl w:ilvl="4" w:tentative="1">
+      <w:start w:val="1"/>
+      <w:numFmt w:val="bullet"/>
+      <w:lvlText w:val=""/>
+      <w:lvlJc w:val="left"/>
+      <w:pPr>
+        <w:tabs>
+          <w:tab w:val="num" w:pos="3600"/>
+        </w:tabs>
+        <w:ind w:left="3600" w:hanging="360"/>
+      </w:pPr>
+      <w:rPr>
+        <w:rFonts w:ascii="Wingdings" w:hAnsi="Wingdings" w:hint="default"/>
+        <w:sz w:val="20"/>
+      </w:rPr>
+    </w:lvl>
+    <w:lvl w:ilvl="5" w:tentative="1">
+      <w:start w:val="1"/>
+      <w:numFmt w:val="bullet"/>
+      <w:lvlText w:val=""/>
+      <w:lvlJc w:val="left"/>
+      <w:pPr>
+        <w:tabs>
+          <w:tab w:val="num" w:pos="4320"/>
+        </w:tabs>
+        <w:ind w:left="4320" w:hanging="360"/>
+      </w:pPr>
+      <w:rPr>
+        <w:rFonts w:ascii="Wingdings" w:hAnsi="Wingdings" w:hint="default"/>
+        <w:sz w:val="20"/>
+      </w:rPr>
+    </w:lvl>
+    <w:lvl w:ilvl="6" w:tentative="1">
+      <w:start w:val="1"/>
+      <w:numFmt w:val="bullet"/>
+      <w:lvlText w:val=""/>
+      <w:lvlJc w:val="left"/>
+      <w:pPr>
+        <w:tabs>
+          <w:tab w:val="num" w:pos="5040"/>
+        </w:tabs>
+        <w:ind w:left="5040" w:hanging="360"/>
+      </w:pPr>
+      <w:rPr>
+        <w:rFonts w:ascii="Wingdings" w:hAnsi="Wingdings" w:hint="default"/>
+        <w:sz w:val="20"/>
+      </w:rPr>
+    </w:lvl>
+    <w:lvl w:ilvl="7" w:tentative="1">
+      <w:start w:val="1"/>
+      <w:numFmt w:val="bullet"/>
+      <w:lvlText w:val=""/>
+      <w:lvlJc w:val="left"/>
+      <w:pPr>
+        <w:tabs>
+          <w:tab w:val="num" w:pos="5760"/>
+        </w:tabs>
+        <w:ind w:left="5760" w:hanging="360"/>
+      </w:pPr>
+      <w:rPr>
+        <w:rFonts w:ascii="Wingdings" w:hAnsi="Wingdings" w:hint="default"/>
+        <w:sz w:val="20"/>
+      </w:rPr>
+    </w:lvl>
+    <w:lvl w:ilvl="8" w:tentative="1">
+      <w:start w:val="1"/>
+      <w:numFmt w:val="bullet"/>
+      <w:lvlText w:val=""/>
+      <w:lvlJc w:val="left"/>
+      <w:pPr>
+        <w:tabs>
+          <w:tab w:val="num" w:pos="6480"/>
+        </w:tabs>
+        <w:ind w:left="6480" w:hanging="360"/>
+      </w:pPr>
+      <w:rPr>
+        <w:rFonts w:ascii="Wingdings" w:hAnsi="Wingdings" w:hint="default"/>
+        <w:sz w:val="20"/>
+      </w:rPr>
+    </w:lvl>
+  </w:abstractNum>
+  <w:abstractNum w:abstractNumId="4">
+    <w:nsid w:val="0D8B527A"/>
+    <w:multiLevelType w:val="multilevel"/>
+    <w:tmpl w:val="A07093AE"/>
+    <w:lvl w:ilvl="0">
+      <w:start w:val="1"/>
+      <w:numFmt w:val="bullet"/>
+      <w:lvlText w:val=""/>
+      <w:lvlJc w:val="left"/>
+      <w:pPr>
+        <w:tabs>
+          <w:tab w:val="num" w:pos="720"/>
+        </w:tabs>
+        <w:ind w:left="720" w:hanging="360"/>
+      </w:pPr>
+      <w:rPr>
+        <w:rFonts w:ascii="Symbol" w:hAnsi="Symbol" w:hint="default"/>
+        <w:sz w:val="20"/>
+      </w:rPr>
+    </w:lvl>
+    <w:lvl w:ilvl="1" w:tentative="1">
+      <w:start w:val="1"/>
+      <w:numFmt w:val="bullet"/>
+      <w:lvlText w:val="o"/>
+      <w:lvlJc w:val="left"/>
+      <w:pPr>
+        <w:tabs>
+          <w:tab w:val="num" w:pos="1440"/>
+        </w:tabs>
+        <w:ind w:left="1440" w:hanging="360"/>
+      </w:pPr>
+      <w:rPr>
+        <w:rFonts w:ascii="Courier New" w:hAnsi="Courier New" w:hint="default"/>
+        <w:sz w:val="20"/>
+      </w:rPr>
+    </w:lvl>
+    <w:lvl w:ilvl="2" w:tentative="1">
+      <w:start w:val="1"/>
+      <w:numFmt w:val="bullet"/>
+      <w:lvlText w:val=""/>
+      <w:lvlJc w:val="left"/>
+      <w:pPr>
+        <w:tabs>
+          <w:tab w:val="num" w:pos="2160"/>
+        </w:tabs>
+        <w:ind w:left="2160" w:hanging="360"/>
+      </w:pPr>
+      <w:rPr>
+        <w:rFonts w:ascii="Wingdings" w:hAnsi="Wingdings" w:hint="default"/>
+        <w:sz w:val="20"/>
+      </w:rPr>
+    </w:lvl>
+    <w:lvl w:ilvl="3" w:tentative="1">
+      <w:start w:val="1"/>
+      <w:numFmt w:val="bullet"/>
+      <w:lvlText w:val=""/>
+      <w:lvlJc w:val="left"/>
+      <w:pPr>
+        <w:tabs>
+          <w:tab w:val="num" w:pos="2880"/>
+        </w:tabs>
+        <w:ind w:left="2880" w:hanging="360"/>
+      </w:pPr>
+      <w:rPr>
+        <w:rFonts w:ascii="Wingdings" w:hAnsi="Wingdings" w:hint="default"/>
+        <w:sz w:val="20"/>
+      </w:rPr>
+    </w:lvl>
+    <w:lvl w:ilvl="4" w:tentative="1">
+      <w:start w:val="1"/>
+      <w:numFmt w:val="bullet"/>
+      <w:lvlText w:val=""/>
+      <w:lvlJc w:val="left"/>
+      <w:pPr>
+        <w:tabs>
+          <w:tab w:val="num" w:pos="3600"/>
+        </w:tabs>
+        <w:ind w:left="3600" w:hanging="360"/>
+      </w:pPr>
+      <w:rPr>
+        <w:rFonts w:ascii="Wingdings" w:hAnsi="Wingdings" w:hint="default"/>
+        <w:sz w:val="20"/>
+      </w:rPr>
+    </w:lvl>
+    <w:lvl w:ilvl="5" w:tentative="1">
+      <w:start w:val="1"/>
+      <w:numFmt w:val="bullet"/>
+      <w:lvlText w:val=""/>
+      <w:lvlJc w:val="left"/>
+      <w:pPr>
+        <w:tabs>
+          <w:tab w:val="num" w:pos="4320"/>
+        </w:tabs>
+        <w:ind w:left="4320" w:hanging="360"/>
+      </w:pPr>
+      <w:rPr>
+        <w:rFonts w:ascii="Wingdings" w:hAnsi="Wingdings" w:hint="default"/>
+        <w:sz w:val="20"/>
+      </w:rPr>
+    </w:lvl>
+    <w:lvl w:ilvl="6" w:tentative="1">
+      <w:start w:val="1"/>
+      <w:numFmt w:val="bullet"/>
+      <w:lvlText w:val=""/>
+      <w:lvlJc w:val="left"/>
+      <w:pPr>
+        <w:tabs>
+          <w:tab w:val="num" w:pos="5040"/>
+        </w:tabs>
+        <w:ind w:left="5040" w:hanging="360"/>
+      </w:pPr>
+      <w:rPr>
+        <w:rFonts w:ascii="Wingdings" w:hAnsi="Wingdings" w:hint="default"/>
+        <w:sz w:val="20"/>
+      </w:rPr>
+    </w:lvl>
+    <w:lvl w:ilvl="7" w:tentative="1">
+      <w:start w:val="1"/>
+      <w:numFmt w:val="bullet"/>
+      <w:lvlText w:val=""/>
+      <w:lvlJc w:val="left"/>
+      <w:pPr>
+        <w:tabs>
+          <w:tab w:val="num" w:pos="5760"/>
+        </w:tabs>
+        <w:ind w:left="5760" w:hanging="360"/>
+      </w:pPr>
+      <w:rPr>
+        <w:rFonts w:ascii="Wingdings" w:hAnsi="Wingdings" w:hint="default"/>
+        <w:sz w:val="20"/>
+      </w:rPr>
+    </w:lvl>
+    <w:lvl w:ilvl="8" w:tentative="1">
+      <w:start w:val="1"/>
+      <w:numFmt w:val="bullet"/>
+      <w:lvlText w:val=""/>
+      <w:lvlJc w:val="left"/>
+      <w:pPr>
+        <w:tabs>
+          <w:tab w:val="num" w:pos="6480"/>
+        </w:tabs>
+        <w:ind w:left="6480" w:hanging="360"/>
+      </w:pPr>
+      <w:rPr>
+        <w:rFonts w:ascii="Wingdings" w:hAnsi="Wingdings" w:hint="default"/>
+        <w:sz w:val="20"/>
+      </w:rPr>
+    </w:lvl>
+  </w:abstractNum>
+  <w:abstractNum w:abstractNumId="5">
+    <w:nsid w:val="32CE4FFA"/>
+    <w:multiLevelType w:val="multilevel"/>
+    <w:tmpl w:val="03285130"/>
+    <w:lvl w:ilvl="0">
+      <w:start w:val="1"/>
+      <w:numFmt w:val="decimal"/>
+      <w:lvlText w:val="%1."/>
+      <w:lvlJc w:val="left"/>
+      <w:pPr>
+        <w:tabs>
+          <w:tab w:val="num" w:pos="720"/>
+        </w:tabs>
+        <w:ind w:left="720" w:hanging="360"/>
+      </w:pPr>
+    </w:lvl>
+    <w:lvl w:ilvl="1" w:tentative="1">
+      <w:start w:val="1"/>
+      <w:numFmt w:val="decimal"/>
+      <w:lvlText w:val="%2."/>
+      <w:lvlJc w:val="left"/>
+      <w:pPr>
+        <w:tabs>
+          <w:tab w:val="num" w:pos="1440"/>
+        </w:tabs>
+        <w:ind w:left="1440" w:hanging="360"/>
+      </w:pPr>
+    </w:lvl>
+    <w:lvl w:ilvl="2" w:tentative="1">
+      <w:start w:val="1"/>
+      <w:numFmt w:val="decimal"/>
+      <w:lvlText w:val="%3."/>
+      <w:lvlJc w:val="left"/>
+      <w:pPr>
+        <w:tabs>
+          <w:tab w:val="num" w:pos="2160"/>
+        </w:tabs>
+        <w:ind w:left="2160" w:hanging="360"/>
+      </w:pPr>
+    </w:lvl>
+    <w:lvl w:ilvl="3" w:tentative="1">
+      <w:start w:val="1"/>
+      <w:numFmt w:val="decimal"/>
+      <w:lvlText w:val="%4."/>
+      <w:lvlJc w:val="left"/>
+      <w:pPr>
+        <w:tabs>
+          <w:tab w:val="num" w:pos="2880"/>
+        </w:tabs>
+        <w:ind w:left="2880" w:hanging="360"/>
+      </w:pPr>
+    </w:lvl>
+    <w:lvl w:ilvl="4" w:tentative="1">
+      <w:start w:val="1"/>
+      <w:numFmt w:val="decimal"/>
+      <w:lvlText w:val="%5."/>
+      <w:lvlJc w:val="left"/>
+      <w:pPr>
+        <w:tabs>
+          <w:tab w:val="num" w:pos="3600"/>
+        </w:tabs>
+        <w:ind w:left="3600" w:hanging="360"/>
+      </w:pPr>
+    </w:lvl>
+    <w:lvl w:ilvl="5" w:tentative="1">
+      <w:start w:val="1"/>
+      <w:numFmt w:val="decimal"/>
+      <w:lvlText w:val="%6."/>
+      <w:lvlJc w:val="left"/>
+      <w:pPr>
+        <w:tabs>
+          <w:tab w:val="num" w:pos="4320"/>
+        </w:tabs>
+        <w:ind w:left="4320" w:hanging="360"/>
+      </w:pPr>
+    </w:lvl>
+    <w:lvl w:ilvl="6" w:tentative="1">
+      <w:start w:val="1"/>
+      <w:numFmt w:val="decimal"/>
+      <w:lvlText w:val="%7."/>
+      <w:lvlJc w:val="left"/>
+      <w:pPr>
+        <w:tabs>
+          <w:tab w:val="num" w:pos="5040"/>
+        </w:tabs>
+        <w:ind w:left="5040" w:hanging="360"/>
+      </w:pPr>
+    </w:lvl>
+    <w:lvl w:ilvl="7" w:tentative="1">
+      <w:start w:val="1"/>
+      <w:numFmt w:val="decimal"/>
+      <w:lvlText w:val="%8."/>
+      <w:lvlJc w:val="left"/>
+      <w:pPr>
+        <w:tabs>
+          <w:tab w:val="num" w:pos="5760"/>
+        </w:tabs>
+        <w:ind w:left="5760" w:hanging="360"/>
+      </w:pPr>
+    </w:lvl>
+    <w:lvl w:ilvl="8" w:tentative="1">
+      <w:start w:val="1"/>
+      <w:numFmt w:val="decimal"/>
+      <w:lvlText w:val="%9."/>
+      <w:lvlJc w:val="left"/>
+      <w:pPr>
+        <w:tabs>
+          <w:tab w:val="num" w:pos="6480"/>
+        </w:tabs>
         <w:ind w:left="6480" w:hanging="360"/>
       </w:pPr>
     </w:lvl>
@@ -1658,6 +2989,15 @@
       <w:startOverride w:val="1"/>
     </w:lvlOverride>
   </w:num>
+  <w:num w:numId="8">
+    <w:abstractNumId w:val="5"/>
+  </w:num>
+  <w:num w:numId="9">
+    <w:abstractNumId w:val="4"/>
+  </w:num>
+  <w:num w:numId="10">
+    <w:abstractNumId w:val="3"/>
+  </w:num>
 </w:numbering>
 </file>
 
@@ -1678,7 +3018,10 @@
       </w:pPr>
     </w:pPrDefault>
   </w:docDefaults>
-  <w:latentStyles w:defLockedState="0" w:defUIPriority="0" w:defSemiHidden="0" w:defUnhideWhenUsed="0" w:defQFormat="0" w:count="267"/>
+  <w:latentStyles w:defLockedState="0" w:defUIPriority="0" w:defSemiHidden="0" w:defUnhideWhenUsed="0" w:defQFormat="0" w:count="267">
+    <w:lsdException w:name="Strong" w:uiPriority="22" w:qFormat="1"/>
+    <w:lsdException w:name="Normal (Web)" w:uiPriority="99"/>
+  </w:latentStyles>
   <w:style w:type="paragraph" w:default="1" w:styleId="Normal">
     <w:name w:val="Normal"/>
     <w:qFormat/>
@@ -1710,7 +3053,6 @@
     <w:next w:val="BodyText"/>
     <w:link w:val="Heading2Char"/>
     <w:uiPriority w:val="9"/>
-    <w:semiHidden/>
     <w:unhideWhenUsed/>
     <w:qFormat/>
     <w:rsid w:val="00A10FD9"/>
@@ -1733,7 +3075,6 @@
     <w:next w:val="BodyText"/>
     <w:link w:val="Heading3Char"/>
     <w:uiPriority w:val="9"/>
-    <w:semiHidden/>
     <w:unhideWhenUsed/>
     <w:qFormat/>
     <w:rsid w:val="00A10FD9"/>
@@ -2074,7 +3415,6 @@
     <w:basedOn w:val="DefaultParagraphFont"/>
     <w:link w:val="Heading2"/>
     <w:uiPriority w:val="9"/>
-    <w:semiHidden/>
     <w:rsid w:val="00A10FD9"/>
     <w:rPr>
       <w:rFonts w:asciiTheme="majorHAnsi" w:eastAsiaTheme="majorEastAsia" w:hAnsiTheme="majorHAnsi" w:cstheme="majorBidi"/>
@@ -2088,7 +3428,6 @@
     <w:basedOn w:val="DefaultParagraphFont"/>
     <w:link w:val="Heading3"/>
     <w:uiPriority w:val="9"/>
-    <w:semiHidden/>
     <w:rsid w:val="00A10FD9"/>
     <w:rPr>
       <w:rFonts w:eastAsiaTheme="majorEastAsia" w:cstheme="majorBidi"/>
@@ -2653,6 +3992,69 @@
       <w:szCs w:val="16"/>
     </w:rPr>
   </w:style>
+  <w:style w:type="character" w:styleId="Strong">
+    <w:name w:val="Strong"/>
+    <w:basedOn w:val="DefaultParagraphFont"/>
+    <w:uiPriority w:val="22"/>
+    <w:qFormat/>
+    <w:rsid w:val="00785E23"/>
+    <w:rPr>
+      <w:b/>
+      <w:bCs/>
+    </w:rPr>
+  </w:style>
+  <w:style w:type="paragraph" w:styleId="NormalWeb">
+    <w:name w:val="Normal (Web)"/>
+    <w:basedOn w:val="Normal"/>
+    <w:uiPriority w:val="99"/>
+    <w:unhideWhenUsed/>
+    <w:rsid w:val="00785E23"/>
+    <w:pPr>
+      <w:spacing w:before="100" w:beforeAutospacing="1" w:after="100" w:afterAutospacing="1"/>
+    </w:pPr>
+    <w:rPr>
+      <w:rFonts w:ascii="Times New Roman" w:eastAsia="Times New Roman" w:hAnsi="Times New Roman" w:cs="Times New Roman"/>
+      <w:lang w:val="en-IN" w:eastAsia="en-IN"/>
+    </w:rPr>
+  </w:style>
+  <w:style w:type="paragraph" w:styleId="Header">
+    <w:name w:val="header"/>
+    <w:basedOn w:val="Normal"/>
+    <w:link w:val="HeaderChar"/>
+    <w:rsid w:val="00785E23"/>
+    <w:pPr>
+      <w:tabs>
+        <w:tab w:val="center" w:pos="4513"/>
+        <w:tab w:val="right" w:pos="9026"/>
+      </w:tabs>
+      <w:spacing w:after="0"/>
+    </w:pPr>
+  </w:style>
+  <w:style w:type="character" w:customStyle="1" w:styleId="HeaderChar">
+    <w:name w:val="Header Char"/>
+    <w:basedOn w:val="DefaultParagraphFont"/>
+    <w:link w:val="Header"/>
+    <w:rsid w:val="00785E23"/>
+  </w:style>
+  <w:style w:type="paragraph" w:styleId="Footer">
+    <w:name w:val="footer"/>
+    <w:basedOn w:val="Normal"/>
+    <w:link w:val="FooterChar"/>
+    <w:rsid w:val="00785E23"/>
+    <w:pPr>
+      <w:tabs>
+        <w:tab w:val="center" w:pos="4513"/>
+        <w:tab w:val="right" w:pos="9026"/>
+      </w:tabs>
+      <w:spacing w:after="0"/>
+    </w:pPr>
+  </w:style>
+  <w:style w:type="character" w:customStyle="1" w:styleId="FooterChar">
+    <w:name w:val="Footer Char"/>
+    <w:basedOn w:val="DefaultParagraphFont"/>
+    <w:link w:val="Footer"/>
+    <w:rsid w:val="00785E23"/>
+  </w:style>
 </w:styles>
 </file>
 
@@ -2673,7 +4075,10 @@
       </w:pPr>
     </w:pPrDefault>
   </w:docDefaults>
-  <w:latentStyles w:defLockedState="0" w:defUIPriority="0" w:defSemiHidden="0" w:defUnhideWhenUsed="0" w:defQFormat="0" w:count="267"/>
+  <w:latentStyles w:defLockedState="0" w:defUIPriority="0" w:defSemiHidden="0" w:defUnhideWhenUsed="0" w:defQFormat="0" w:count="267">
+    <w:lsdException w:name="Strong" w:uiPriority="22" w:qFormat="1"/>
+    <w:lsdException w:name="Normal (Web)" w:uiPriority="99"/>
+  </w:latentStyles>
   <w:style w:type="paragraph" w:default="1" w:styleId="Normal">
     <w:name w:val="Normal"/>
     <w:qFormat/>
@@ -2705,7 +4110,6 @@
     <w:next w:val="BodyText"/>
     <w:link w:val="Heading2Char"/>
     <w:uiPriority w:val="9"/>
-    <w:semiHidden/>
     <w:unhideWhenUsed/>
     <w:qFormat/>
     <w:rsid w:val="00A10FD9"/>
@@ -2728,7 +4132,6 @@
     <w:next w:val="BodyText"/>
     <w:link w:val="Heading3Char"/>
     <w:uiPriority w:val="9"/>
-    <w:semiHidden/>
     <w:unhideWhenUsed/>
     <w:qFormat/>
     <w:rsid w:val="00A10FD9"/>
@@ -3069,7 +4472,6 @@
     <w:basedOn w:val="DefaultParagraphFont"/>
     <w:link w:val="Heading2"/>
     <w:uiPriority w:val="9"/>
-    <w:semiHidden/>
     <w:rsid w:val="00A10FD9"/>
     <w:rPr>
       <w:rFonts w:asciiTheme="majorHAnsi" w:eastAsiaTheme="majorEastAsia" w:hAnsiTheme="majorHAnsi" w:cstheme="majorBidi"/>
@@ -3083,7 +4485,6 @@
     <w:basedOn w:val="DefaultParagraphFont"/>
     <w:link w:val="Heading3"/>
     <w:uiPriority w:val="9"/>
-    <w:semiHidden/>
     <w:rsid w:val="00A10FD9"/>
     <w:rPr>
       <w:rFonts w:eastAsiaTheme="majorEastAsia" w:cstheme="majorBidi"/>
@@ -3647,6 +5048,69 @@
       <w:sz w:val="16"/>
       <w:szCs w:val="16"/>
     </w:rPr>
+  </w:style>
+  <w:style w:type="character" w:styleId="Strong">
+    <w:name w:val="Strong"/>
+    <w:basedOn w:val="DefaultParagraphFont"/>
+    <w:uiPriority w:val="22"/>
+    <w:qFormat/>
+    <w:rsid w:val="00785E23"/>
+    <w:rPr>
+      <w:b/>
+      <w:bCs/>
+    </w:rPr>
+  </w:style>
+  <w:style w:type="paragraph" w:styleId="NormalWeb">
+    <w:name w:val="Normal (Web)"/>
+    <w:basedOn w:val="Normal"/>
+    <w:uiPriority w:val="99"/>
+    <w:unhideWhenUsed/>
+    <w:rsid w:val="00785E23"/>
+    <w:pPr>
+      <w:spacing w:before="100" w:beforeAutospacing="1" w:after="100" w:afterAutospacing="1"/>
+    </w:pPr>
+    <w:rPr>
+      <w:rFonts w:ascii="Times New Roman" w:eastAsia="Times New Roman" w:hAnsi="Times New Roman" w:cs="Times New Roman"/>
+      <w:lang w:val="en-IN" w:eastAsia="en-IN"/>
+    </w:rPr>
+  </w:style>
+  <w:style w:type="paragraph" w:styleId="Header">
+    <w:name w:val="header"/>
+    <w:basedOn w:val="Normal"/>
+    <w:link w:val="HeaderChar"/>
+    <w:rsid w:val="00785E23"/>
+    <w:pPr>
+      <w:tabs>
+        <w:tab w:val="center" w:pos="4513"/>
+        <w:tab w:val="right" w:pos="9026"/>
+      </w:tabs>
+      <w:spacing w:after="0"/>
+    </w:pPr>
+  </w:style>
+  <w:style w:type="character" w:customStyle="1" w:styleId="HeaderChar">
+    <w:name w:val="Header Char"/>
+    <w:basedOn w:val="DefaultParagraphFont"/>
+    <w:link w:val="Header"/>
+    <w:rsid w:val="00785E23"/>
+  </w:style>
+  <w:style w:type="paragraph" w:styleId="Footer">
+    <w:name w:val="footer"/>
+    <w:basedOn w:val="Normal"/>
+    <w:link w:val="FooterChar"/>
+    <w:rsid w:val="00785E23"/>
+    <w:pPr>
+      <w:tabs>
+        <w:tab w:val="center" w:pos="4513"/>
+        <w:tab w:val="right" w:pos="9026"/>
+      </w:tabs>
+      <w:spacing w:after="0"/>
+    </w:pPr>
+  </w:style>
+  <w:style w:type="character" w:customStyle="1" w:styleId="FooterChar">
+    <w:name w:val="Footer Char"/>
+    <w:basedOn w:val="DefaultParagraphFont"/>
+    <w:link w:val="Footer"/>
+    <w:rsid w:val="00785E23"/>
   </w:style>
 </w:styles>
 </file>
@@ -3940,7 +5404,7 @@
   <a:extraClrSchemeLst/>
   <a:extLst>
     <a:ext uri="{05A4C25C-085E-4340-85A3-A5531E510DB2}">
-      <thm15:themeFamily xmlns="" xmlns:thm15="http://schemas.microsoft.com/office/thememl/2012/main" name="Office Theme" id="{2E142A2C-CD16-42D6-873A-C26D2A0506FA}" vid="{1BDDFF52-6CD6-40A5-AB3C-68EB2F1E4D0A}"/>
+      <thm15:themeFamily xmlns:thm15="http://schemas.microsoft.com/office/thememl/2012/main" xmlns="" name="Office Theme" id="{2E142A2C-CD16-42D6-873A-C26D2A0506FA}" vid="{1BDDFF52-6CD6-40A5-AB3C-68EB2F1E4D0A}"/>
     </a:ext>
   </a:extLst>
 </a:theme>

</xml_diff>